<commit_message>
Rehace los documentos del Hito 3 con el estilo del documento de diseño del Hito 2 y aclara la cuenta de los menores
Co-Authored-By: Claude Sonnet 5.5 <noreply@anthropic.com>
</commit_message>
<xml_diff>
--- a/docs/seguridad/01-gestion-del-consentimiento.docx
+++ b/docs/seguridad/01-gestion-del-consentimiento.docx
@@ -4,104 +4,117 @@
   <w:body>
     <w:p>
       <w:pPr>
-        <w:pStyle w:val="Heading1"/>
-      </w:pPr>
-      <w:r>
-        <w:rPr>
-          <w:rFonts w:ascii="Calibri" w:cs="Calibri" w:eastAsia="Calibri" w:hAnsi="Calibri"/>
-        </w:rPr>
-        <w:t xml:space="preserve">Diseño del módulo de gestión del consentimiento</w:t>
+        <w:spacing w:after="60" w:before="600"/>
+      </w:pPr>
+      <w:r>
+        <w:rPr>
+          <w:rFonts w:ascii="Calibri" w:cs="Calibri" w:eastAsia="Calibri" w:hAnsi="Calibri"/>
+          <w:color w:val="55666A"/>
+          <w:sz w:val="28"/>
+          <w:szCs w:val="28"/>
+        </w:rPr>
+        <w:t xml:space="preserve">Centro Médico Altavida</w:t>
       </w:r>
     </w:p>
     <w:p>
       <w:pPr>
         <w:spacing w:after="120"/>
       </w:pPr>
-      <w:r>
-        <w:rPr>
-          <w:rFonts w:ascii="Calibri" w:cs="Calibri" w:eastAsia="Calibri" w:hAnsi="Calibri"/>
-          <w:sz w:val="22"/>
-          <w:szCs w:val="22"/>
-        </w:rPr>
-        <w:t xml:space="preserve">Centro Médico Altavida · IIT421W Seguridad y Protección de Datos · Actividad 4 (Hito 3)</w:t>
-      </w:r>
-    </w:p>
-    <w:p>
-      <w:pPr>
-        <w:pStyle w:val="Heading2"/>
-      </w:pPr>
-      <w:r>
-        <w:rPr>
-          <w:rFonts w:ascii="Calibri" w:cs="Calibri" w:eastAsia="Calibri" w:hAnsi="Calibri"/>
-        </w:rPr>
-        <w:t xml:space="preserve">1. Qué consentimiento se gestiona y cuál no</w:t>
-      </w:r>
-    </w:p>
-    <w:p>
-      <w:pPr>
-        <w:spacing w:after="120"/>
-      </w:pPr>
-      <w:r>
-        <w:rPr>
-          <w:rFonts w:ascii="Calibri" w:cs="Calibri" w:eastAsia="Calibri" w:hAnsi="Calibri"/>
-          <w:sz w:val="22"/>
-          <w:szCs w:val="22"/>
-        </w:rPr>
-        <w:t xml:space="preserve">El análisis de bases de licitud del Hito 1 concluyó que la atención clínica (ficha, diagnósticos, recetas, resultados, agendamiento) </w:t>
-      </w:r>
       <w:r>
         <w:rPr>
           <w:rFonts w:ascii="Calibri" w:cs="Calibri" w:eastAsia="Calibri" w:hAnsi="Calibri"/>
           <w:b/>
           <w:bCs/>
-          <w:sz w:val="22"/>
-          <w:szCs w:val="22"/>
-        </w:rPr>
-        <w:t xml:space="preserve">no se funda en el consentimiento</w:t>
-      </w:r>
-      <w:r>
-        <w:rPr>
-          <w:rFonts w:ascii="Calibri" w:cs="Calibri" w:eastAsia="Calibri" w:hAnsi="Calibri"/>
-          <w:sz w:val="22"/>
-          <w:szCs w:val="22"/>
-        </w:rPr>
-        <w:t xml:space="preserve">: se funda en la obligación legal de llevar la ficha (Ley 20.584 y DS 41/2012 de Salud), en la ejecución del contrato de atención y en la excepción para el tratamiento de datos de salud con fines asistenciales. Pedir un "autorizo el tratamiento de mis datos" para eso sería engañoso, porque el paciente no podría rechazarlo sin perder la atención, y el consentimiento libre exige poder negarse sin consecuencias.</w:t>
+          <w:color w:val="0F6E6A"/>
+          <w:sz w:val="52"/>
+          <w:szCs w:val="52"/>
+        </w:rPr>
+        <w:t xml:space="preserve">Diseño del módulo de gestión del consentimiento</w:t>
+      </w:r>
+    </w:p>
+    <w:p>
+      <w:pPr>
+        <w:spacing w:after="120" w:line="276"/>
+      </w:pPr>
+      <w:r>
+        <w:rPr>
+          <w:rFonts w:ascii="Calibri" w:cs="Calibri" w:eastAsia="Calibri" w:hAnsi="Calibri"/>
+          <w:color w:val="55666A"/>
+          <w:sz w:val="24"/>
+          <w:szCs w:val="24"/>
+        </w:rPr>
+        <w:t xml:space="preserve">IIT421W Seguridad y Protección de Datos · Actividad 4 (Hito 3)</w:t>
       </w:r>
     </w:p>
     <w:p>
       <w:pPr>
         <w:spacing w:after="120"/>
       </w:pPr>
-      <w:r>
-        <w:rPr>
-          <w:rFonts w:ascii="Calibri" w:cs="Calibri" w:eastAsia="Calibri" w:hAnsi="Calibri"/>
-          <w:sz w:val="22"/>
-          <w:szCs w:val="22"/>
-        </w:rPr>
-        <w:t xml:space="preserve">Por eso el módulo gestiona solo los usos que el paciente </w:t>
+    </w:p>
+    <w:p>
+      <w:pPr>
+        <w:pStyle w:val="Heading1"/>
+      </w:pPr>
+      <w:r>
+        <w:rPr>
+          <w:rFonts w:ascii="Calibri" w:cs="Calibri" w:eastAsia="Calibri" w:hAnsi="Calibri"/>
+        </w:rPr>
+        <w:t xml:space="preserve">1. Qué consentimiento se gestiona y cuál no</w:t>
+      </w:r>
+    </w:p>
+    <w:p>
+      <w:pPr>
+        <w:spacing w:after="120" w:line="276"/>
+      </w:pPr>
+      <w:r>
+        <w:rPr>
+          <w:rFonts w:ascii="Calibri" w:cs="Calibri" w:eastAsia="Calibri" w:hAnsi="Calibri"/>
+        </w:rPr>
+        <w:t xml:space="preserve">El análisis de bases de licitud del Hito 1 concluyó que la atención clínica (ficha, diagnósticos, recetas, resultados, agendamiento) </w:t>
       </w:r>
       <w:r>
         <w:rPr>
           <w:rFonts w:ascii="Calibri" w:cs="Calibri" w:eastAsia="Calibri" w:hAnsi="Calibri"/>
           <w:b/>
           <w:bCs/>
-          <w:sz w:val="22"/>
-          <w:szCs w:val="22"/>
+        </w:rPr>
+        <w:t xml:space="preserve">no se funda en el consentimiento</w:t>
+      </w:r>
+      <w:r>
+        <w:rPr>
+          <w:rFonts w:ascii="Calibri" w:cs="Calibri" w:eastAsia="Calibri" w:hAnsi="Calibri"/>
+        </w:rPr>
+        <w:t xml:space="preserve">: se funda en la obligación legal de llevar la ficha (Ley 20.584 y DS 41/2012 de Salud), en la ejecución del contrato de atención y en la excepción para el tratamiento de datos de salud con fines asistenciales. Pedir un "autorizo el tratamiento de mis datos" para eso sería engañoso, porque el paciente no podría rechazarlo sin perder la atención, y el consentimiento libre exige poder negarse sin consecuencias.</w:t>
+      </w:r>
+    </w:p>
+    <w:p>
+      <w:pPr>
+        <w:spacing w:after="120" w:line="276"/>
+      </w:pPr>
+      <w:r>
+        <w:rPr>
+          <w:rFonts w:ascii="Calibri" w:cs="Calibri" w:eastAsia="Calibri" w:hAnsi="Calibri"/>
+        </w:rPr>
+        <w:t xml:space="preserve">Por eso el módulo gestiona solo los usos que el paciente </w:t>
+      </w:r>
+      <w:r>
+        <w:rPr>
+          <w:rFonts w:ascii="Calibri" w:cs="Calibri" w:eastAsia="Calibri" w:hAnsi="Calibri"/>
+          <w:b/>
+          <w:bCs/>
         </w:rPr>
         <w:t xml:space="preserve">puede rechazar sin perder su atención</w:t>
       </w:r>
       <w:r>
         <w:rPr>
           <w:rFonts w:ascii="Calibri" w:cs="Calibri" w:eastAsia="Calibri" w:hAnsi="Calibri"/>
-          <w:sz w:val="22"/>
-          <w:szCs w:val="22"/>
         </w:rPr>
         <w:t xml:space="preserve">. Hoy son dos finalidades, una por canal:</w:t>
       </w:r>
     </w:p>
     <w:tbl>
       <w:tblPr>
-        <w:tblW w:type="dxa" w:w="9360"/>
+        <w:tblW w:type="dxa" w:w="10080"/>
         <w:tblBorders>
           <w:top w:val="single" w:color="auto" w:sz="4"/>
           <w:left w:val="single" w:color="auto" w:sz="4"/>
@@ -112,25 +125,26 @@
         </w:tblBorders>
       </w:tblPr>
       <w:tblGrid>
-        <w:gridCol w:w="2340"/>
-        <w:gridCol w:w="2340"/>
-        <w:gridCol w:w="2340"/>
-        <w:gridCol w:w="2340"/>
+        <w:gridCol w:w="1380"/>
+        <w:gridCol w:w="2692"/>
+        <w:gridCol w:w="3523"/>
+        <w:gridCol w:w="2485"/>
       </w:tblGrid>
       <w:tr>
         <w:trPr>
+          <w:cantSplit w:val="off"/>
           <w:tblHeader/>
         </w:trPr>
         <w:tc>
           <w:tcPr>
-            <w:tcW w:type="dxa" w:w="2340"/>
+            <w:tcW w:type="dxa" w:w="1380"/>
             <w:tcBorders>
-              <w:top w:val="single" w:color="BBBBBB" w:sz="4"/>
-              <w:left w:val="single" w:color="BBBBBB" w:sz="4"/>
-              <w:bottom w:val="single" w:color="BBBBBB" w:sz="4"/>
-              <w:right w:val="single" w:color="BBBBBB" w:sz="4"/>
+              <w:top w:val="single" w:color="C9D6D3" w:sz="4"/>
+              <w:left w:val="single" w:color="C9D6D3" w:sz="4"/>
+              <w:bottom w:val="single" w:color="C9D6D3" w:sz="4"/>
+              <w:right w:val="single" w:color="C9D6D3" w:sz="4"/>
             </w:tcBorders>
-            <w:shd w:fill="E6EEF5" w:val="clear"/>
+            <w:shd w:fill="E3F1EF" w:color="auto" w:val="clear"/>
             <w:tcMar>
               <w:top w:type="dxa" w:w="60"/>
               <w:left w:type="dxa" w:w="100"/>
@@ -139,13 +153,18 @@
             </w:tcMar>
           </w:tcPr>
           <w:p>
+            <w:pPr>
+              <w:spacing w:after="40"/>
+              <w:jc w:val="left"/>
+            </w:pPr>
             <w:r>
               <w:rPr>
                 <w:rFonts w:ascii="Calibri" w:cs="Calibri" w:eastAsia="Calibri" w:hAnsi="Calibri"/>
                 <w:b/>
                 <w:bCs/>
-                <w:sz w:val="19"/>
-                <w:szCs w:val="19"/>
+                <w:color w:val="0F6E6A"/>
+                <w:sz w:val="18"/>
+                <w:szCs w:val="18"/>
               </w:rPr>
               <w:t xml:space="preserve">Código</w:t>
             </w:r>
@@ -153,14 +172,14 @@
         </w:tc>
         <w:tc>
           <w:tcPr>
-            <w:tcW w:type="dxa" w:w="2340"/>
+            <w:tcW w:type="dxa" w:w="2692"/>
             <w:tcBorders>
-              <w:top w:val="single" w:color="BBBBBB" w:sz="4"/>
-              <w:left w:val="single" w:color="BBBBBB" w:sz="4"/>
-              <w:bottom w:val="single" w:color="BBBBBB" w:sz="4"/>
-              <w:right w:val="single" w:color="BBBBBB" w:sz="4"/>
+              <w:top w:val="single" w:color="C9D6D3" w:sz="4"/>
+              <w:left w:val="single" w:color="C9D6D3" w:sz="4"/>
+              <w:bottom w:val="single" w:color="C9D6D3" w:sz="4"/>
+              <w:right w:val="single" w:color="C9D6D3" w:sz="4"/>
             </w:tcBorders>
-            <w:shd w:fill="E6EEF5" w:val="clear"/>
+            <w:shd w:fill="E3F1EF" w:color="auto" w:val="clear"/>
             <w:tcMar>
               <w:top w:type="dxa" w:w="60"/>
               <w:left w:type="dxa" w:w="100"/>
@@ -169,13 +188,18 @@
             </w:tcMar>
           </w:tcPr>
           <w:p>
+            <w:pPr>
+              <w:spacing w:after="40"/>
+              <w:jc w:val="left"/>
+            </w:pPr>
             <w:r>
               <w:rPr>
                 <w:rFonts w:ascii="Calibri" w:cs="Calibri" w:eastAsia="Calibri" w:hAnsi="Calibri"/>
                 <w:b/>
                 <w:bCs/>
-                <w:sz w:val="19"/>
-                <w:szCs w:val="19"/>
+                <w:color w:val="0F6E6A"/>
+                <w:sz w:val="18"/>
+                <w:szCs w:val="18"/>
               </w:rPr>
               <w:t xml:space="preserve">Finalidad</w:t>
             </w:r>
@@ -183,14 +207,14 @@
         </w:tc>
         <w:tc>
           <w:tcPr>
-            <w:tcW w:type="dxa" w:w="2340"/>
+            <w:tcW w:type="dxa" w:w="3523"/>
             <w:tcBorders>
-              <w:top w:val="single" w:color="BBBBBB" w:sz="4"/>
-              <w:left w:val="single" w:color="BBBBBB" w:sz="4"/>
-              <w:bottom w:val="single" w:color="BBBBBB" w:sz="4"/>
-              <w:right w:val="single" w:color="BBBBBB" w:sz="4"/>
+              <w:top w:val="single" w:color="C9D6D3" w:sz="4"/>
+              <w:left w:val="single" w:color="C9D6D3" w:sz="4"/>
+              <w:bottom w:val="single" w:color="C9D6D3" w:sz="4"/>
+              <w:right w:val="single" w:color="C9D6D3" w:sz="4"/>
             </w:tcBorders>
-            <w:shd w:fill="E6EEF5" w:val="clear"/>
+            <w:shd w:fill="E3F1EF" w:color="auto" w:val="clear"/>
             <w:tcMar>
               <w:top w:type="dxa" w:w="60"/>
               <w:left w:type="dxa" w:w="100"/>
@@ -199,13 +223,18 @@
             </w:tcMar>
           </w:tcPr>
           <w:p>
+            <w:pPr>
+              <w:spacing w:after="40"/>
+              <w:jc w:val="left"/>
+            </w:pPr>
             <w:r>
               <w:rPr>
                 <w:rFonts w:ascii="Calibri" w:cs="Calibri" w:eastAsia="Calibri" w:hAnsi="Calibri"/>
                 <w:b/>
                 <w:bCs/>
-                <w:sz w:val="19"/>
-                <w:szCs w:val="19"/>
+                <w:color w:val="0F6E6A"/>
+                <w:sz w:val="18"/>
+                <w:szCs w:val="18"/>
               </w:rPr>
               <w:t xml:space="preserve">Dato que usa</w:t>
             </w:r>
@@ -213,14 +242,14 @@
         </w:tc>
         <w:tc>
           <w:tcPr>
-            <w:tcW w:type="dxa" w:w="2340"/>
+            <w:tcW w:type="dxa" w:w="2485"/>
             <w:tcBorders>
-              <w:top w:val="single" w:color="BBBBBB" w:sz="4"/>
-              <w:left w:val="single" w:color="BBBBBB" w:sz="4"/>
-              <w:bottom w:val="single" w:color="BBBBBB" w:sz="4"/>
-              <w:right w:val="single" w:color="BBBBBB" w:sz="4"/>
+              <w:top w:val="single" w:color="C9D6D3" w:sz="4"/>
+              <w:left w:val="single" w:color="C9D6D3" w:sz="4"/>
+              <w:bottom w:val="single" w:color="C9D6D3" w:sz="4"/>
+              <w:right w:val="single" w:color="C9D6D3" w:sz="4"/>
             </w:tcBorders>
-            <w:shd w:fill="E6EEF5" w:val="clear"/>
+            <w:shd w:fill="E3F1EF" w:color="auto" w:val="clear"/>
             <w:tcMar>
               <w:top w:type="dxa" w:w="60"/>
               <w:left w:type="dxa" w:w="100"/>
@@ -229,13 +258,18 @@
             </w:tcMar>
           </w:tcPr>
           <w:p>
+            <w:pPr>
+              <w:spacing w:after="40"/>
+              <w:jc w:val="left"/>
+            </w:pPr>
             <w:r>
               <w:rPr>
                 <w:rFonts w:ascii="Calibri" w:cs="Calibri" w:eastAsia="Calibri" w:hAnsi="Calibri"/>
                 <w:b/>
                 <w:bCs/>
-                <w:sz w:val="19"/>
-                <w:szCs w:val="19"/>
+                <w:color w:val="0F6E6A"/>
+                <w:sz w:val="18"/>
+                <w:szCs w:val="18"/>
               </w:rPr>
               <w:t xml:space="preserve">Fundamento</w:t>
             </w:r>
@@ -244,16 +278,17 @@
       </w:tr>
       <w:tr>
         <w:trPr>
+          <w:cantSplit/>
           <w:tblHeader w:val="off"/>
         </w:trPr>
         <w:tc>
           <w:tcPr>
-            <w:tcW w:type="dxa" w:w="2340"/>
+            <w:tcW w:type="dxa" w:w="1380"/>
             <w:tcBorders>
-              <w:top w:val="single" w:color="BBBBBB" w:sz="4"/>
-              <w:left w:val="single" w:color="BBBBBB" w:sz="4"/>
-              <w:bottom w:val="single" w:color="BBBBBB" w:sz="4"/>
-              <w:right w:val="single" w:color="BBBBBB" w:sz="4"/>
+              <w:top w:val="single" w:color="C9D6D3" w:sz="4"/>
+              <w:left w:val="single" w:color="C9D6D3" w:sz="4"/>
+              <w:bottom w:val="single" w:color="C9D6D3" w:sz="4"/>
+              <w:right w:val="single" w:color="C9D6D3" w:sz="4"/>
             </w:tcBorders>
             <w:tcMar>
               <w:top w:type="dxa" w:w="60"/>
@@ -263,13 +298,17 @@
             </w:tcMar>
           </w:tcPr>
           <w:p>
+            <w:pPr>
+              <w:spacing w:after="40"/>
+              <w:jc w:val="left"/>
+            </w:pPr>
             <w:r>
               <w:rPr>
                 <w:rFonts w:ascii="Consolas" w:cs="Consolas" w:eastAsia="Consolas" w:hAnsi="Consolas"/>
                 <w:b w:val="false"/>
                 <w:bCs w:val="false"/>
-                <w:sz w:val="19"/>
-                <w:szCs w:val="19"/>
+                <w:sz w:val="16"/>
+                <w:szCs w:val="16"/>
               </w:rPr>
               <w:t xml:space="preserve">RECORDATORIOS_CORREO</w:t>
             </w:r>
@@ -277,12 +316,12 @@
         </w:tc>
         <w:tc>
           <w:tcPr>
-            <w:tcW w:type="dxa" w:w="2340"/>
+            <w:tcW w:type="dxa" w:w="2692"/>
             <w:tcBorders>
-              <w:top w:val="single" w:color="BBBBBB" w:sz="4"/>
-              <w:left w:val="single" w:color="BBBBBB" w:sz="4"/>
-              <w:bottom w:val="single" w:color="BBBBBB" w:sz="4"/>
-              <w:right w:val="single" w:color="BBBBBB" w:sz="4"/>
+              <w:top w:val="single" w:color="C9D6D3" w:sz="4"/>
+              <w:left w:val="single" w:color="C9D6D3" w:sz="4"/>
+              <w:bottom w:val="single" w:color="C9D6D3" w:sz="4"/>
+              <w:right w:val="single" w:color="C9D6D3" w:sz="4"/>
             </w:tcBorders>
             <w:tcMar>
               <w:top w:type="dxa" w:w="60"/>
@@ -292,13 +331,15 @@
             </w:tcMar>
           </w:tcPr>
           <w:p>
+            <w:pPr>
+              <w:spacing w:after="40"/>
+              <w:jc w:val="left"/>
+            </w:pPr>
             <w:r>
               <w:rPr>
                 <w:rFonts w:ascii="Calibri" w:cs="Calibri" w:eastAsia="Calibri" w:hAnsi="Calibri"/>
-                <w:b w:val="false"/>
-                <w:bCs w:val="false"/>
-                <w:sz w:val="19"/>
-                <w:szCs w:val="19"/>
+                <w:sz w:val="18"/>
+                <w:szCs w:val="18"/>
               </w:rPr>
               <w:t xml:space="preserve">Avisar por correo de las próximas citas</w:t>
             </w:r>
@@ -306,12 +347,12 @@
         </w:tc>
         <w:tc>
           <w:tcPr>
-            <w:tcW w:type="dxa" w:w="2340"/>
+            <w:tcW w:type="dxa" w:w="3523"/>
             <w:tcBorders>
-              <w:top w:val="single" w:color="BBBBBB" w:sz="4"/>
-              <w:left w:val="single" w:color="BBBBBB" w:sz="4"/>
-              <w:bottom w:val="single" w:color="BBBBBB" w:sz="4"/>
-              <w:right w:val="single" w:color="BBBBBB" w:sz="4"/>
+              <w:top w:val="single" w:color="C9D6D3" w:sz="4"/>
+              <w:left w:val="single" w:color="C9D6D3" w:sz="4"/>
+              <w:bottom w:val="single" w:color="C9D6D3" w:sz="4"/>
+              <w:right w:val="single" w:color="C9D6D3" w:sz="4"/>
             </w:tcBorders>
             <w:tcMar>
               <w:top w:type="dxa" w:w="60"/>
@@ -321,13 +362,15 @@
             </w:tcMar>
           </w:tcPr>
           <w:p>
+            <w:pPr>
+              <w:spacing w:after="40"/>
+              <w:jc w:val="left"/>
+            </w:pPr>
             <w:r>
               <w:rPr>
                 <w:rFonts w:ascii="Calibri" w:cs="Calibri" w:eastAsia="Calibri" w:hAnsi="Calibri"/>
-                <w:b w:val="false"/>
-                <w:bCs w:val="false"/>
-                <w:sz w:val="19"/>
-                <w:szCs w:val="19"/>
+                <w:sz w:val="18"/>
+                <w:szCs w:val="18"/>
               </w:rPr>
               <w:t xml:space="preserve">Correo, nombre de pila, fecha, hora y profesional</w:t>
             </w:r>
@@ -335,12 +378,12 @@
         </w:tc>
         <w:tc>
           <w:tcPr>
-            <w:tcW w:type="dxa" w:w="2340"/>
+            <w:tcW w:type="dxa" w:w="2485"/>
             <w:tcBorders>
-              <w:top w:val="single" w:color="BBBBBB" w:sz="4"/>
-              <w:left w:val="single" w:color="BBBBBB" w:sz="4"/>
-              <w:bottom w:val="single" w:color="BBBBBB" w:sz="4"/>
-              <w:right w:val="single" w:color="BBBBBB" w:sz="4"/>
+              <w:top w:val="single" w:color="C9D6D3" w:sz="4"/>
+              <w:left w:val="single" w:color="C9D6D3" w:sz="4"/>
+              <w:bottom w:val="single" w:color="C9D6D3" w:sz="4"/>
+              <w:right w:val="single" w:color="C9D6D3" w:sz="4"/>
             </w:tcBorders>
             <w:tcMar>
               <w:top w:type="dxa" w:w="60"/>
@@ -350,13 +393,15 @@
             </w:tcMar>
           </w:tcPr>
           <w:p>
+            <w:pPr>
+              <w:spacing w:after="40"/>
+              <w:jc w:val="left"/>
+            </w:pPr>
             <w:r>
               <w:rPr>
                 <w:rFonts w:ascii="Calibri" w:cs="Calibri" w:eastAsia="Calibri" w:hAnsi="Calibri"/>
-                <w:b w:val="false"/>
-                <w:bCs w:val="false"/>
-                <w:sz w:val="19"/>
-                <w:szCs w:val="19"/>
+                <w:sz w:val="18"/>
+                <w:szCs w:val="18"/>
               </w:rPr>
               <w:t xml:space="preserve">Consentimiento (Ley 21.719, art. 12)</w:t>
             </w:r>
@@ -365,16 +410,17 @@
       </w:tr>
       <w:tr>
         <w:trPr>
+          <w:cantSplit/>
           <w:tblHeader w:val="off"/>
         </w:trPr>
         <w:tc>
           <w:tcPr>
-            <w:tcW w:type="dxa" w:w="2340"/>
+            <w:tcW w:type="dxa" w:w="1380"/>
             <w:tcBorders>
-              <w:top w:val="single" w:color="BBBBBB" w:sz="4"/>
-              <w:left w:val="single" w:color="BBBBBB" w:sz="4"/>
-              <w:bottom w:val="single" w:color="BBBBBB" w:sz="4"/>
-              <w:right w:val="single" w:color="BBBBBB" w:sz="4"/>
+              <w:top w:val="single" w:color="C9D6D3" w:sz="4"/>
+              <w:left w:val="single" w:color="C9D6D3" w:sz="4"/>
+              <w:bottom w:val="single" w:color="C9D6D3" w:sz="4"/>
+              <w:right w:val="single" w:color="C9D6D3" w:sz="4"/>
             </w:tcBorders>
             <w:tcMar>
               <w:top w:type="dxa" w:w="60"/>
@@ -384,13 +430,17 @@
             </w:tcMar>
           </w:tcPr>
           <w:p>
+            <w:pPr>
+              <w:spacing w:after="40"/>
+              <w:jc w:val="left"/>
+            </w:pPr>
             <w:r>
               <w:rPr>
                 <w:rFonts w:ascii="Consolas" w:cs="Consolas" w:eastAsia="Consolas" w:hAnsi="Consolas"/>
                 <w:b w:val="false"/>
                 <w:bCs w:val="false"/>
-                <w:sz w:val="19"/>
-                <w:szCs w:val="19"/>
+                <w:sz w:val="16"/>
+                <w:szCs w:val="16"/>
               </w:rPr>
               <w:t xml:space="preserve">RECORDATORIOS_SMS</w:t>
             </w:r>
@@ -398,12 +448,12 @@
         </w:tc>
         <w:tc>
           <w:tcPr>
-            <w:tcW w:type="dxa" w:w="2340"/>
+            <w:tcW w:type="dxa" w:w="2692"/>
             <w:tcBorders>
-              <w:top w:val="single" w:color="BBBBBB" w:sz="4"/>
-              <w:left w:val="single" w:color="BBBBBB" w:sz="4"/>
-              <w:bottom w:val="single" w:color="BBBBBB" w:sz="4"/>
-              <w:right w:val="single" w:color="BBBBBB" w:sz="4"/>
+              <w:top w:val="single" w:color="C9D6D3" w:sz="4"/>
+              <w:left w:val="single" w:color="C9D6D3" w:sz="4"/>
+              <w:bottom w:val="single" w:color="C9D6D3" w:sz="4"/>
+              <w:right w:val="single" w:color="C9D6D3" w:sz="4"/>
             </w:tcBorders>
             <w:tcMar>
               <w:top w:type="dxa" w:w="60"/>
@@ -413,13 +463,15 @@
             </w:tcMar>
           </w:tcPr>
           <w:p>
+            <w:pPr>
+              <w:spacing w:after="40"/>
+              <w:jc w:val="left"/>
+            </w:pPr>
             <w:r>
               <w:rPr>
                 <w:rFonts w:ascii="Calibri" w:cs="Calibri" w:eastAsia="Calibri" w:hAnsi="Calibri"/>
-                <w:b w:val="false"/>
-                <w:bCs w:val="false"/>
-                <w:sz w:val="19"/>
-                <w:szCs w:val="19"/>
+                <w:sz w:val="18"/>
+                <w:szCs w:val="18"/>
               </w:rPr>
               <w:t xml:space="preserve">Avisar por SMS de las próximas citas</w:t>
             </w:r>
@@ -427,12 +479,12 @@
         </w:tc>
         <w:tc>
           <w:tcPr>
-            <w:tcW w:type="dxa" w:w="2340"/>
+            <w:tcW w:type="dxa" w:w="3523"/>
             <w:tcBorders>
-              <w:top w:val="single" w:color="BBBBBB" w:sz="4"/>
-              <w:left w:val="single" w:color="BBBBBB" w:sz="4"/>
-              <w:bottom w:val="single" w:color="BBBBBB" w:sz="4"/>
-              <w:right w:val="single" w:color="BBBBBB" w:sz="4"/>
+              <w:top w:val="single" w:color="C9D6D3" w:sz="4"/>
+              <w:left w:val="single" w:color="C9D6D3" w:sz="4"/>
+              <w:bottom w:val="single" w:color="C9D6D3" w:sz="4"/>
+              <w:right w:val="single" w:color="C9D6D3" w:sz="4"/>
             </w:tcBorders>
             <w:tcMar>
               <w:top w:type="dxa" w:w="60"/>
@@ -442,13 +494,15 @@
             </w:tcMar>
           </w:tcPr>
           <w:p>
+            <w:pPr>
+              <w:spacing w:after="40"/>
+              <w:jc w:val="left"/>
+            </w:pPr>
             <w:r>
               <w:rPr>
                 <w:rFonts w:ascii="Calibri" w:cs="Calibri" w:eastAsia="Calibri" w:hAnsi="Calibri"/>
-                <w:b w:val="false"/>
-                <w:bCs w:val="false"/>
-                <w:sz w:val="19"/>
-                <w:szCs w:val="19"/>
+                <w:sz w:val="18"/>
+                <w:szCs w:val="18"/>
               </w:rPr>
               <w:t xml:space="preserve">Teléfono, nombre de pila, fecha, hora y profesional</w:t>
             </w:r>
@@ -456,12 +510,12 @@
         </w:tc>
         <w:tc>
           <w:tcPr>
-            <w:tcW w:type="dxa" w:w="2340"/>
+            <w:tcW w:type="dxa" w:w="2485"/>
             <w:tcBorders>
-              <w:top w:val="single" w:color="BBBBBB" w:sz="4"/>
-              <w:left w:val="single" w:color="BBBBBB" w:sz="4"/>
-              <w:bottom w:val="single" w:color="BBBBBB" w:sz="4"/>
-              <w:right w:val="single" w:color="BBBBBB" w:sz="4"/>
+              <w:top w:val="single" w:color="C9D6D3" w:sz="4"/>
+              <w:left w:val="single" w:color="C9D6D3" w:sz="4"/>
+              <w:bottom w:val="single" w:color="C9D6D3" w:sz="4"/>
+              <w:right w:val="single" w:color="C9D6D3" w:sz="4"/>
             </w:tcBorders>
             <w:tcMar>
               <w:top w:type="dxa" w:w="60"/>
@@ -471,13 +525,15 @@
             </w:tcMar>
           </w:tcPr>
           <w:p>
+            <w:pPr>
+              <w:spacing w:after="40"/>
+              <w:jc w:val="left"/>
+            </w:pPr>
             <w:r>
               <w:rPr>
                 <w:rFonts w:ascii="Calibri" w:cs="Calibri" w:eastAsia="Calibri" w:hAnsi="Calibri"/>
-                <w:b w:val="false"/>
-                <w:bCs w:val="false"/>
-                <w:sz w:val="19"/>
-                <w:szCs w:val="19"/>
+                <w:sz w:val="18"/>
+                <w:szCs w:val="18"/>
               </w:rPr>
               <w:t xml:space="preserve">Consentimiento (Ley 21.719, art. 12)</w:t>
             </w:r>
@@ -485,78 +541,76 @@
         </w:tc>
       </w:tr>
     </w:tbl>
-    <w:p/>
     <w:p>
       <w:pPr>
         <w:spacing w:after="120"/>
       </w:pPr>
-      <w:r>
-        <w:rPr>
-          <w:rFonts w:ascii="Calibri" w:cs="Calibri" w:eastAsia="Calibri" w:hAnsi="Calibri"/>
-          <w:sz w:val="22"/>
-          <w:szCs w:val="22"/>
+    </w:p>
+    <w:p>
+      <w:pPr>
+        <w:spacing w:after="120" w:line="276"/>
+      </w:pPr>
+      <w:r>
+        <w:rPr>
+          <w:rFonts w:ascii="Calibri" w:cs="Calibri" w:eastAsia="Calibri" w:hAnsi="Calibri"/>
         </w:rPr>
         <w:t xml:space="preserve">Ningún recordatorio incluye diagnósticos ni datos clínicos. Agregar una finalidad nueva es cargar una fila en </w:t>
       </w:r>
       <w:r>
         <w:rPr>
           <w:rFonts w:ascii="Consolas" w:cs="Consolas" w:eastAsia="Consolas" w:hAnsi="Consolas"/>
-          <w:sz w:val="22"/>
-          <w:szCs w:val="22"/>
+          <w:b w:val="false"/>
+          <w:bCs w:val="false"/>
+          <w:sz w:val="19"/>
+          <w:szCs w:val="19"/>
         </w:rPr>
         <w:t xml:space="preserve">Finalidad</w:t>
       </w:r>
       <w:r>
         <w:rPr>
           <w:rFonts w:ascii="Calibri" w:cs="Calibri" w:eastAsia="Calibri" w:hAnsi="Calibri"/>
-          <w:sz w:val="22"/>
-          <w:szCs w:val="22"/>
         </w:rPr>
         <w:t xml:space="preserve"> y su primer texto; no requiere cambiar el modelo.</w:t>
       </w:r>
     </w:p>
     <w:p>
       <w:pPr>
-        <w:spacing w:after="120"/>
+        <w:spacing w:after="120" w:line="276"/>
       </w:pPr>
       <w:r>
         <w:rPr>
           <w:rFonts w:ascii="Calibri" w:cs="Calibri" w:eastAsia="Calibri" w:hAnsi="Calibri"/>
           <w:b/>
           <w:bCs/>
-          <w:sz w:val="22"/>
-          <w:szCs w:val="22"/>
         </w:rPr>
         <w:t xml:space="preserve">Cambio frente a la versión anterior.</w:t>
       </w:r>
       <w:r>
         <w:rPr>
           <w:rFonts w:ascii="Calibri" w:cs="Calibri" w:eastAsia="Calibri" w:hAnsi="Calibri"/>
-          <w:sz w:val="22"/>
-          <w:szCs w:val="22"/>
         </w:rPr>
         <w:t xml:space="preserve"> El registro tenía una casilla única "autorizo el tratamiento de mis datos personales y de salud" y un booleano </w:t>
       </w:r>
       <w:r>
         <w:rPr>
           <w:rFonts w:ascii="Consolas" w:cs="Consolas" w:eastAsia="Consolas" w:hAnsi="Consolas"/>
-          <w:sz w:val="22"/>
-          <w:szCs w:val="22"/>
+          <w:b w:val="false"/>
+          <w:bCs w:val="false"/>
+          <w:sz w:val="19"/>
+          <w:szCs w:val="19"/>
         </w:rPr>
         <w:t xml:space="preserve">recordatorios_activos</w:t>
       </w:r>
       <w:r>
         <w:rPr>
           <w:rFonts w:ascii="Calibri" w:cs="Calibri" w:eastAsia="Calibri" w:hAnsi="Calibri"/>
-          <w:sz w:val="22"/>
-          <w:szCs w:val="22"/>
         </w:rPr>
         <w:t xml:space="preserve"> que activaba correo y SMS a la vez. Se reemplazaron por: (a) un acuse de lectura del aviso de privacidad, que no es consentimiento, y (b) consentimientos opcionales, sin marcar de antemano, uno por canal.</w:t>
       </w:r>
     </w:p>
     <w:p>
       <w:pPr>
-        <w:pStyle w:val="Heading2"/>
+        <w:pStyle w:val="Heading1"/>
       </w:pPr>
       <w:r>
         <w:rPr>
@@ -567,7 +621,7 @@
     </w:p>
     <w:tbl>
       <w:tblPr>
-        <w:tblW w:type="dxa" w:w="9360"/>
+        <w:tblW w:type="dxa" w:w="10080"/>
         <w:tblBorders>
           <w:top w:val="single" w:color="auto" w:sz="4"/>
           <w:left w:val="single" w:color="auto" w:sz="4"/>
@@ -578,24 +632,25 @@
         </w:tblBorders>
       </w:tblPr>
       <w:tblGrid>
-        <w:gridCol w:w="3120"/>
-        <w:gridCol w:w="3120"/>
-        <w:gridCol w:w="3120"/>
+        <w:gridCol w:w="2143"/>
+        <w:gridCol w:w="3881"/>
+        <w:gridCol w:w="4056"/>
       </w:tblGrid>
       <w:tr>
         <w:trPr>
+          <w:cantSplit w:val="off"/>
           <w:tblHeader/>
         </w:trPr>
         <w:tc>
           <w:tcPr>
-            <w:tcW w:type="dxa" w:w="3120"/>
+            <w:tcW w:type="dxa" w:w="2143"/>
             <w:tcBorders>
-              <w:top w:val="single" w:color="BBBBBB" w:sz="4"/>
-              <w:left w:val="single" w:color="BBBBBB" w:sz="4"/>
-              <w:bottom w:val="single" w:color="BBBBBB" w:sz="4"/>
-              <w:right w:val="single" w:color="BBBBBB" w:sz="4"/>
+              <w:top w:val="single" w:color="C9D6D3" w:sz="4"/>
+              <w:left w:val="single" w:color="C9D6D3" w:sz="4"/>
+              <w:bottom w:val="single" w:color="C9D6D3" w:sz="4"/>
+              <w:right w:val="single" w:color="C9D6D3" w:sz="4"/>
             </w:tcBorders>
-            <w:shd w:fill="E6EEF5" w:val="clear"/>
+            <w:shd w:fill="E3F1EF" w:color="auto" w:val="clear"/>
             <w:tcMar>
               <w:top w:type="dxa" w:w="60"/>
               <w:left w:type="dxa" w:w="100"/>
@@ -604,13 +659,18 @@
             </w:tcMar>
           </w:tcPr>
           <w:p>
+            <w:pPr>
+              <w:spacing w:after="40"/>
+              <w:jc w:val="left"/>
+            </w:pPr>
             <w:r>
               <w:rPr>
                 <w:rFonts w:ascii="Calibri" w:cs="Calibri" w:eastAsia="Calibri" w:hAnsi="Calibri"/>
                 <w:b/>
                 <w:bCs/>
-                <w:sz w:val="19"/>
-                <w:szCs w:val="19"/>
+                <w:color w:val="0F6E6A"/>
+                <w:sz w:val="18"/>
+                <w:szCs w:val="18"/>
               </w:rPr>
               <w:t xml:space="preserve">Tabla</w:t>
             </w:r>
@@ -618,14 +678,14 @@
         </w:tc>
         <w:tc>
           <w:tcPr>
-            <w:tcW w:type="dxa" w:w="3120"/>
+            <w:tcW w:type="dxa" w:w="3881"/>
             <w:tcBorders>
-              <w:top w:val="single" w:color="BBBBBB" w:sz="4"/>
-              <w:left w:val="single" w:color="BBBBBB" w:sz="4"/>
-              <w:bottom w:val="single" w:color="BBBBBB" w:sz="4"/>
-              <w:right w:val="single" w:color="BBBBBB" w:sz="4"/>
+              <w:top w:val="single" w:color="C9D6D3" w:sz="4"/>
+              <w:left w:val="single" w:color="C9D6D3" w:sz="4"/>
+              <w:bottom w:val="single" w:color="C9D6D3" w:sz="4"/>
+              <w:right w:val="single" w:color="C9D6D3" w:sz="4"/>
             </w:tcBorders>
-            <w:shd w:fill="E6EEF5" w:val="clear"/>
+            <w:shd w:fill="E3F1EF" w:color="auto" w:val="clear"/>
             <w:tcMar>
               <w:top w:type="dxa" w:w="60"/>
               <w:left w:type="dxa" w:w="100"/>
@@ -634,13 +694,18 @@
             </w:tcMar>
           </w:tcPr>
           <w:p>
+            <w:pPr>
+              <w:spacing w:after="40"/>
+              <w:jc w:val="left"/>
+            </w:pPr>
             <w:r>
               <w:rPr>
                 <w:rFonts w:ascii="Calibri" w:cs="Calibri" w:eastAsia="Calibri" w:hAnsi="Calibri"/>
                 <w:b/>
                 <w:bCs/>
-                <w:sz w:val="19"/>
-                <w:szCs w:val="19"/>
+                <w:color w:val="0F6E6A"/>
+                <w:sz w:val="18"/>
+                <w:szCs w:val="18"/>
               </w:rPr>
               <w:t xml:space="preserve">Para qué sirve</w:t>
             </w:r>
@@ -648,14 +713,14 @@
         </w:tc>
         <w:tc>
           <w:tcPr>
-            <w:tcW w:type="dxa" w:w="3120"/>
+            <w:tcW w:type="dxa" w:w="4056"/>
             <w:tcBorders>
-              <w:top w:val="single" w:color="BBBBBB" w:sz="4"/>
-              <w:left w:val="single" w:color="BBBBBB" w:sz="4"/>
-              <w:bottom w:val="single" w:color="BBBBBB" w:sz="4"/>
-              <w:right w:val="single" w:color="BBBBBB" w:sz="4"/>
+              <w:top w:val="single" w:color="C9D6D3" w:sz="4"/>
+              <w:left w:val="single" w:color="C9D6D3" w:sz="4"/>
+              <w:bottom w:val="single" w:color="C9D6D3" w:sz="4"/>
+              <w:right w:val="single" w:color="C9D6D3" w:sz="4"/>
             </w:tcBorders>
-            <w:shd w:fill="E6EEF5" w:val="clear"/>
+            <w:shd w:fill="E3F1EF" w:color="auto" w:val="clear"/>
             <w:tcMar>
               <w:top w:type="dxa" w:w="60"/>
               <w:left w:type="dxa" w:w="100"/>
@@ -664,13 +729,18 @@
             </w:tcMar>
           </w:tcPr>
           <w:p>
+            <w:pPr>
+              <w:spacing w:after="40"/>
+              <w:jc w:val="left"/>
+            </w:pPr>
             <w:r>
               <w:rPr>
                 <w:rFonts w:ascii="Calibri" w:cs="Calibri" w:eastAsia="Calibri" w:hAnsi="Calibri"/>
                 <w:b/>
                 <w:bCs/>
-                <w:sz w:val="19"/>
-                <w:szCs w:val="19"/>
+                <w:color w:val="0F6E6A"/>
+                <w:sz w:val="18"/>
+                <w:szCs w:val="18"/>
               </w:rPr>
               <w:t xml:space="preserve">Campos principales</w:t>
             </w:r>
@@ -679,16 +749,17 @@
       </w:tr>
       <w:tr>
         <w:trPr>
+          <w:cantSplit/>
           <w:tblHeader w:val="off"/>
         </w:trPr>
         <w:tc>
           <w:tcPr>
-            <w:tcW w:type="dxa" w:w="3120"/>
+            <w:tcW w:type="dxa" w:w="2143"/>
             <w:tcBorders>
-              <w:top w:val="single" w:color="BBBBBB" w:sz="4"/>
-              <w:left w:val="single" w:color="BBBBBB" w:sz="4"/>
-              <w:bottom w:val="single" w:color="BBBBBB" w:sz="4"/>
-              <w:right w:val="single" w:color="BBBBBB" w:sz="4"/>
+              <w:top w:val="single" w:color="C9D6D3" w:sz="4"/>
+              <w:left w:val="single" w:color="C9D6D3" w:sz="4"/>
+              <w:bottom w:val="single" w:color="C9D6D3" w:sz="4"/>
+              <w:right w:val="single" w:color="C9D6D3" w:sz="4"/>
             </w:tcBorders>
             <w:tcMar>
               <w:top w:type="dxa" w:w="60"/>
@@ -698,13 +769,17 @@
             </w:tcMar>
           </w:tcPr>
           <w:p>
+            <w:pPr>
+              <w:spacing w:after="40"/>
+              <w:jc w:val="left"/>
+            </w:pPr>
             <w:r>
               <w:rPr>
                 <w:rFonts w:ascii="Consolas" w:cs="Consolas" w:eastAsia="Consolas" w:hAnsi="Consolas"/>
                 <w:b w:val="false"/>
                 <w:bCs w:val="false"/>
-                <w:sz w:val="19"/>
-                <w:szCs w:val="19"/>
+                <w:sz w:val="16"/>
+                <w:szCs w:val="16"/>
               </w:rPr>
               <w:t xml:space="preserve">Finalidad</w:t>
             </w:r>
@@ -712,12 +787,12 @@
         </w:tc>
         <w:tc>
           <w:tcPr>
-            <w:tcW w:type="dxa" w:w="3120"/>
+            <w:tcW w:type="dxa" w:w="3881"/>
             <w:tcBorders>
-              <w:top w:val="single" w:color="BBBBBB" w:sz="4"/>
-              <w:left w:val="single" w:color="BBBBBB" w:sz="4"/>
-              <w:bottom w:val="single" w:color="BBBBBB" w:sz="4"/>
-              <w:right w:val="single" w:color="BBBBBB" w:sz="4"/>
+              <w:top w:val="single" w:color="C9D6D3" w:sz="4"/>
+              <w:left w:val="single" w:color="C9D6D3" w:sz="4"/>
+              <w:bottom w:val="single" w:color="C9D6D3" w:sz="4"/>
+              <w:right w:val="single" w:color="C9D6D3" w:sz="4"/>
             </w:tcBorders>
             <w:tcMar>
               <w:top w:type="dxa" w:w="60"/>
@@ -727,13 +802,15 @@
             </w:tcMar>
           </w:tcPr>
           <w:p>
+            <w:pPr>
+              <w:spacing w:after="40"/>
+              <w:jc w:val="left"/>
+            </w:pPr>
             <w:r>
               <w:rPr>
                 <w:rFonts w:ascii="Calibri" w:cs="Calibri" w:eastAsia="Calibri" w:hAnsi="Calibri"/>
-                <w:b w:val="false"/>
-                <w:bCs w:val="false"/>
-                <w:sz w:val="19"/>
-                <w:szCs w:val="19"/>
+                <w:sz w:val="18"/>
+                <w:szCs w:val="18"/>
               </w:rPr>
               <w:t xml:space="preserve">Catálogo de finalidades consentibles</w:t>
             </w:r>
@@ -741,12 +818,12 @@
         </w:tc>
         <w:tc>
           <w:tcPr>
-            <w:tcW w:type="dxa" w:w="3120"/>
+            <w:tcW w:type="dxa" w:w="4056"/>
             <w:tcBorders>
-              <w:top w:val="single" w:color="BBBBBB" w:sz="4"/>
-              <w:left w:val="single" w:color="BBBBBB" w:sz="4"/>
-              <w:bottom w:val="single" w:color="BBBBBB" w:sz="4"/>
-              <w:right w:val="single" w:color="BBBBBB" w:sz="4"/>
+              <w:top w:val="single" w:color="C9D6D3" w:sz="4"/>
+              <w:left w:val="single" w:color="C9D6D3" w:sz="4"/>
+              <w:bottom w:val="single" w:color="C9D6D3" w:sz="4"/>
+              <w:right w:val="single" w:color="C9D6D3" w:sz="4"/>
             </w:tcBorders>
             <w:tcMar>
               <w:top w:type="dxa" w:w="60"/>
@@ -756,13 +833,15 @@
             </w:tcMar>
           </w:tcPr>
           <w:p>
+            <w:pPr>
+              <w:spacing w:after="40"/>
+              <w:jc w:val="left"/>
+            </w:pPr>
             <w:r>
               <w:rPr>
                 <w:rFonts w:ascii="Calibri" w:cs="Calibri" w:eastAsia="Calibri" w:hAnsi="Calibri"/>
-                <w:b w:val="false"/>
-                <w:bCs w:val="false"/>
-                <w:sz w:val="19"/>
-                <w:szCs w:val="19"/>
+                <w:sz w:val="18"/>
+                <w:szCs w:val="18"/>
               </w:rPr>
               <w:t xml:space="preserve">código, nombre, descripción, dato usado, base de licitud, canal, versión mínima válida, activa</w:t>
             </w:r>
@@ -771,16 +850,17 @@
       </w:tr>
       <w:tr>
         <w:trPr>
+          <w:cantSplit/>
           <w:tblHeader w:val="off"/>
         </w:trPr>
         <w:tc>
           <w:tcPr>
-            <w:tcW w:type="dxa" w:w="3120"/>
+            <w:tcW w:type="dxa" w:w="2143"/>
             <w:tcBorders>
-              <w:top w:val="single" w:color="BBBBBB" w:sz="4"/>
-              <w:left w:val="single" w:color="BBBBBB" w:sz="4"/>
-              <w:bottom w:val="single" w:color="BBBBBB" w:sz="4"/>
-              <w:right w:val="single" w:color="BBBBBB" w:sz="4"/>
+              <w:top w:val="single" w:color="C9D6D3" w:sz="4"/>
+              <w:left w:val="single" w:color="C9D6D3" w:sz="4"/>
+              <w:bottom w:val="single" w:color="C9D6D3" w:sz="4"/>
+              <w:right w:val="single" w:color="C9D6D3" w:sz="4"/>
             </w:tcBorders>
             <w:tcMar>
               <w:top w:type="dxa" w:w="60"/>
@@ -790,13 +870,17 @@
             </w:tcMar>
           </w:tcPr>
           <w:p>
+            <w:pPr>
+              <w:spacing w:after="40"/>
+              <w:jc w:val="left"/>
+            </w:pPr>
             <w:r>
               <w:rPr>
                 <w:rFonts w:ascii="Consolas" w:cs="Consolas" w:eastAsia="Consolas" w:hAnsi="Consolas"/>
                 <w:b w:val="false"/>
                 <w:bCs w:val="false"/>
-                <w:sz w:val="19"/>
-                <w:szCs w:val="19"/>
+                <w:sz w:val="16"/>
+                <w:szCs w:val="16"/>
               </w:rPr>
               <w:t xml:space="preserve">TextoConsentimiento</w:t>
             </w:r>
@@ -804,12 +888,12 @@
         </w:tc>
         <w:tc>
           <w:tcPr>
-            <w:tcW w:type="dxa" w:w="3120"/>
+            <w:tcW w:type="dxa" w:w="3881"/>
             <w:tcBorders>
-              <w:top w:val="single" w:color="BBBBBB" w:sz="4"/>
-              <w:left w:val="single" w:color="BBBBBB" w:sz="4"/>
-              <w:bottom w:val="single" w:color="BBBBBB" w:sz="4"/>
-              <w:right w:val="single" w:color="BBBBBB" w:sz="4"/>
+              <w:top w:val="single" w:color="C9D6D3" w:sz="4"/>
+              <w:left w:val="single" w:color="C9D6D3" w:sz="4"/>
+              <w:bottom w:val="single" w:color="C9D6D3" w:sz="4"/>
+              <w:right w:val="single" w:color="C9D6D3" w:sz="4"/>
             </w:tcBorders>
             <w:tcMar>
               <w:top w:type="dxa" w:w="60"/>
@@ -819,13 +903,15 @@
             </w:tcMar>
           </w:tcPr>
           <w:p>
+            <w:pPr>
+              <w:spacing w:after="40"/>
+              <w:jc w:val="left"/>
+            </w:pPr>
             <w:r>
               <w:rPr>
                 <w:rFonts w:ascii="Calibri" w:cs="Calibri" w:eastAsia="Calibri" w:hAnsi="Calibri"/>
-                <w:b w:val="false"/>
-                <w:bCs w:val="false"/>
-                <w:sz w:val="19"/>
-                <w:szCs w:val="19"/>
+                <w:sz w:val="18"/>
+                <w:szCs w:val="18"/>
               </w:rPr>
               <w:t xml:space="preserve">Texto exacto mostrado, con versión. Inalterable</w:t>
             </w:r>
@@ -833,12 +919,12 @@
         </w:tc>
         <w:tc>
           <w:tcPr>
-            <w:tcW w:type="dxa" w:w="3120"/>
+            <w:tcW w:type="dxa" w:w="4056"/>
             <w:tcBorders>
-              <w:top w:val="single" w:color="BBBBBB" w:sz="4"/>
-              <w:left w:val="single" w:color="BBBBBB" w:sz="4"/>
-              <w:bottom w:val="single" w:color="BBBBBB" w:sz="4"/>
-              <w:right w:val="single" w:color="BBBBBB" w:sz="4"/>
+              <w:top w:val="single" w:color="C9D6D3" w:sz="4"/>
+              <w:left w:val="single" w:color="C9D6D3" w:sz="4"/>
+              <w:bottom w:val="single" w:color="C9D6D3" w:sz="4"/>
+              <w:right w:val="single" w:color="C9D6D3" w:sz="4"/>
             </w:tcBorders>
             <w:tcMar>
               <w:top w:type="dxa" w:w="60"/>
@@ -848,13 +934,15 @@
             </w:tcMar>
           </w:tcPr>
           <w:p>
+            <w:pPr>
+              <w:spacing w:after="40"/>
+              <w:jc w:val="left"/>
+            </w:pPr>
             <w:r>
               <w:rPr>
                 <w:rFonts w:ascii="Calibri" w:cs="Calibri" w:eastAsia="Calibri" w:hAnsi="Calibri"/>
-                <w:b w:val="false"/>
-                <w:bCs w:val="false"/>
-                <w:sz w:val="19"/>
-                <w:szCs w:val="19"/>
+                <w:sz w:val="18"/>
+                <w:szCs w:val="18"/>
               </w:rPr>
               <w:t xml:space="preserve">finalidad, versión, texto, huella SHA-256, fecha de publicación, cambia alcance</w:t>
             </w:r>
@@ -863,16 +951,17 @@
       </w:tr>
       <w:tr>
         <w:trPr>
+          <w:cantSplit/>
           <w:tblHeader w:val="off"/>
         </w:trPr>
         <w:tc>
           <w:tcPr>
-            <w:tcW w:type="dxa" w:w="3120"/>
+            <w:tcW w:type="dxa" w:w="2143"/>
             <w:tcBorders>
-              <w:top w:val="single" w:color="BBBBBB" w:sz="4"/>
-              <w:left w:val="single" w:color="BBBBBB" w:sz="4"/>
-              <w:bottom w:val="single" w:color="BBBBBB" w:sz="4"/>
-              <w:right w:val="single" w:color="BBBBBB" w:sz="4"/>
+              <w:top w:val="single" w:color="C9D6D3" w:sz="4"/>
+              <w:left w:val="single" w:color="C9D6D3" w:sz="4"/>
+              <w:bottom w:val="single" w:color="C9D6D3" w:sz="4"/>
+              <w:right w:val="single" w:color="C9D6D3" w:sz="4"/>
             </w:tcBorders>
             <w:tcMar>
               <w:top w:type="dxa" w:w="60"/>
@@ -882,13 +971,17 @@
             </w:tcMar>
           </w:tcPr>
           <w:p>
+            <w:pPr>
+              <w:spacing w:after="40"/>
+              <w:jc w:val="left"/>
+            </w:pPr>
             <w:r>
               <w:rPr>
                 <w:rFonts w:ascii="Consolas" w:cs="Consolas" w:eastAsia="Consolas" w:hAnsi="Consolas"/>
                 <w:b w:val="false"/>
                 <w:bCs w:val="false"/>
-                <w:sz w:val="19"/>
-                <w:szCs w:val="19"/>
+                <w:sz w:val="16"/>
+                <w:szCs w:val="16"/>
               </w:rPr>
               <w:t xml:space="preserve">Consentimiento</w:t>
             </w:r>
@@ -896,12 +989,12 @@
         </w:tc>
         <w:tc>
           <w:tcPr>
-            <w:tcW w:type="dxa" w:w="3120"/>
+            <w:tcW w:type="dxa" w:w="3881"/>
             <w:tcBorders>
-              <w:top w:val="single" w:color="BBBBBB" w:sz="4"/>
-              <w:left w:val="single" w:color="BBBBBB" w:sz="4"/>
-              <w:bottom w:val="single" w:color="BBBBBB" w:sz="4"/>
-              <w:right w:val="single" w:color="BBBBBB" w:sz="4"/>
+              <w:top w:val="single" w:color="C9D6D3" w:sz="4"/>
+              <w:left w:val="single" w:color="C9D6D3" w:sz="4"/>
+              <w:bottom w:val="single" w:color="C9D6D3" w:sz="4"/>
+              <w:right w:val="single" w:color="C9D6D3" w:sz="4"/>
             </w:tcBorders>
             <w:tcMar>
               <w:top w:type="dxa" w:w="60"/>
@@ -911,13 +1004,15 @@
             </w:tcMar>
           </w:tcPr>
           <w:p>
+            <w:pPr>
+              <w:spacing w:after="40"/>
+              <w:jc w:val="left"/>
+            </w:pPr>
             <w:r>
               <w:rPr>
                 <w:rFonts w:ascii="Calibri" w:cs="Calibri" w:eastAsia="Calibri" w:hAnsi="Calibri"/>
-                <w:b w:val="false"/>
-                <w:bCs w:val="false"/>
-                <w:sz w:val="19"/>
-                <w:szCs w:val="19"/>
+                <w:sz w:val="18"/>
+                <w:szCs w:val="18"/>
               </w:rPr>
               <w:t xml:space="preserve">Estado actual por paciente y finalidad (único por par)</w:t>
             </w:r>
@@ -925,12 +1020,12 @@
         </w:tc>
         <w:tc>
           <w:tcPr>
-            <w:tcW w:type="dxa" w:w="3120"/>
+            <w:tcW w:type="dxa" w:w="4056"/>
             <w:tcBorders>
-              <w:top w:val="single" w:color="BBBBBB" w:sz="4"/>
-              <w:left w:val="single" w:color="BBBBBB" w:sz="4"/>
-              <w:bottom w:val="single" w:color="BBBBBB" w:sz="4"/>
-              <w:right w:val="single" w:color="BBBBBB" w:sz="4"/>
+              <w:top w:val="single" w:color="C9D6D3" w:sz="4"/>
+              <w:left w:val="single" w:color="C9D6D3" w:sz="4"/>
+              <w:bottom w:val="single" w:color="C9D6D3" w:sz="4"/>
+              <w:right w:val="single" w:color="C9D6D3" w:sz="4"/>
             </w:tcBorders>
             <w:tcMar>
               <w:top w:type="dxa" w:w="60"/>
@@ -940,13 +1035,15 @@
             </w:tcMar>
           </w:tcPr>
           <w:p>
+            <w:pPr>
+              <w:spacing w:after="40"/>
+              <w:jc w:val="left"/>
+            </w:pPr>
             <w:r>
               <w:rPr>
                 <w:rFonts w:ascii="Calibri" w:cs="Calibri" w:eastAsia="Calibri" w:hAnsi="Calibri"/>
-                <w:b w:val="false"/>
-                <w:bCs w:val="false"/>
-                <w:sz w:val="19"/>
-                <w:szCs w:val="19"/>
+                <w:sz w:val="18"/>
+                <w:szCs w:val="18"/>
               </w:rPr>
               <w:t xml:space="preserve">paciente, finalidad, texto aceptado, estado (otorgado/revocado), fecha de otorgamiento, fecha de revocación, otorgante, representación</w:t>
             </w:r>
@@ -955,16 +1052,17 @@
       </w:tr>
       <w:tr>
         <w:trPr>
+          <w:cantSplit/>
           <w:tblHeader w:val="off"/>
         </w:trPr>
         <w:tc>
           <w:tcPr>
-            <w:tcW w:type="dxa" w:w="3120"/>
+            <w:tcW w:type="dxa" w:w="2143"/>
             <w:tcBorders>
-              <w:top w:val="single" w:color="BBBBBB" w:sz="4"/>
-              <w:left w:val="single" w:color="BBBBBB" w:sz="4"/>
-              <w:bottom w:val="single" w:color="BBBBBB" w:sz="4"/>
-              <w:right w:val="single" w:color="BBBBBB" w:sz="4"/>
+              <w:top w:val="single" w:color="C9D6D3" w:sz="4"/>
+              <w:left w:val="single" w:color="C9D6D3" w:sz="4"/>
+              <w:bottom w:val="single" w:color="C9D6D3" w:sz="4"/>
+              <w:right w:val="single" w:color="C9D6D3" w:sz="4"/>
             </w:tcBorders>
             <w:tcMar>
               <w:top w:type="dxa" w:w="60"/>
@@ -974,13 +1072,17 @@
             </w:tcMar>
           </w:tcPr>
           <w:p>
+            <w:pPr>
+              <w:spacing w:after="40"/>
+              <w:jc w:val="left"/>
+            </w:pPr>
             <w:r>
               <w:rPr>
                 <w:rFonts w:ascii="Consolas" w:cs="Consolas" w:eastAsia="Consolas" w:hAnsi="Consolas"/>
                 <w:b w:val="false"/>
                 <w:bCs w:val="false"/>
-                <w:sz w:val="19"/>
-                <w:szCs w:val="19"/>
+                <w:sz w:val="16"/>
+                <w:szCs w:val="16"/>
               </w:rPr>
               <w:t xml:space="preserve">RegistroConsentimiento</w:t>
             </w:r>
@@ -988,12 +1090,12 @@
         </w:tc>
         <w:tc>
           <w:tcPr>
-            <w:tcW w:type="dxa" w:w="3120"/>
+            <w:tcW w:type="dxa" w:w="3881"/>
             <w:tcBorders>
-              <w:top w:val="single" w:color="BBBBBB" w:sz="4"/>
-              <w:left w:val="single" w:color="BBBBBB" w:sz="4"/>
-              <w:bottom w:val="single" w:color="BBBBBB" w:sz="4"/>
-              <w:right w:val="single" w:color="BBBBBB" w:sz="4"/>
+              <w:top w:val="single" w:color="C9D6D3" w:sz="4"/>
+              <w:left w:val="single" w:color="C9D6D3" w:sz="4"/>
+              <w:bottom w:val="single" w:color="C9D6D3" w:sz="4"/>
+              <w:right w:val="single" w:color="C9D6D3" w:sz="4"/>
             </w:tcBorders>
             <w:tcMar>
               <w:top w:type="dxa" w:w="60"/>
@@ -1003,13 +1105,15 @@
             </w:tcMar>
           </w:tcPr>
           <w:p>
+            <w:pPr>
+              <w:spacing w:after="40"/>
+              <w:jc w:val="left"/>
+            </w:pPr>
             <w:r>
               <w:rPr>
                 <w:rFonts w:ascii="Calibri" w:cs="Calibri" w:eastAsia="Calibri" w:hAnsi="Calibri"/>
-                <w:b w:val="false"/>
-                <w:bCs w:val="false"/>
-                <w:sz w:val="19"/>
-                <w:szCs w:val="19"/>
+                <w:sz w:val="18"/>
+                <w:szCs w:val="18"/>
               </w:rPr>
               <w:t xml:space="preserve">Historial: una fila por cada otorgamiento o revocación. Inalterable</w:t>
             </w:r>
@@ -1017,12 +1121,12 @@
         </w:tc>
         <w:tc>
           <w:tcPr>
-            <w:tcW w:type="dxa" w:w="3120"/>
+            <w:tcW w:type="dxa" w:w="4056"/>
             <w:tcBorders>
-              <w:top w:val="single" w:color="BBBBBB" w:sz="4"/>
-              <w:left w:val="single" w:color="BBBBBB" w:sz="4"/>
-              <w:bottom w:val="single" w:color="BBBBBB" w:sz="4"/>
-              <w:right w:val="single" w:color="BBBBBB" w:sz="4"/>
+              <w:top w:val="single" w:color="C9D6D3" w:sz="4"/>
+              <w:left w:val="single" w:color="C9D6D3" w:sz="4"/>
+              <w:bottom w:val="single" w:color="C9D6D3" w:sz="4"/>
+              <w:right w:val="single" w:color="C9D6D3" w:sz="4"/>
             </w:tcBorders>
             <w:tcMar>
               <w:top w:type="dxa" w:w="60"/>
@@ -1032,13 +1136,15 @@
             </w:tcMar>
           </w:tcPr>
           <w:p>
+            <w:pPr>
+              <w:spacing w:after="40"/>
+              <w:jc w:val="left"/>
+            </w:pPr>
             <w:r>
               <w:rPr>
                 <w:rFonts w:ascii="Calibri" w:cs="Calibri" w:eastAsia="Calibri" w:hAnsi="Calibri"/>
-                <w:b w:val="false"/>
-                <w:bCs w:val="false"/>
-                <w:sz w:val="19"/>
-                <w:szCs w:val="19"/>
+                <w:sz w:val="18"/>
+                <w:szCs w:val="18"/>
               </w:rPr>
               <w:t xml:space="preserve">paciente, finalidad, texto, acción, fecha y hora, otorgante, representación, canal, cuenta que registró</w:t>
             </w:r>
@@ -1047,16 +1153,17 @@
       </w:tr>
       <w:tr>
         <w:trPr>
+          <w:cantSplit/>
           <w:tblHeader w:val="off"/>
         </w:trPr>
         <w:tc>
           <w:tcPr>
-            <w:tcW w:type="dxa" w:w="3120"/>
+            <w:tcW w:type="dxa" w:w="2143"/>
             <w:tcBorders>
-              <w:top w:val="single" w:color="BBBBBB" w:sz="4"/>
-              <w:left w:val="single" w:color="BBBBBB" w:sz="4"/>
-              <w:bottom w:val="single" w:color="BBBBBB" w:sz="4"/>
-              <w:right w:val="single" w:color="BBBBBB" w:sz="4"/>
+              <w:top w:val="single" w:color="C9D6D3" w:sz="4"/>
+              <w:left w:val="single" w:color="C9D6D3" w:sz="4"/>
+              <w:bottom w:val="single" w:color="C9D6D3" w:sz="4"/>
+              <w:right w:val="single" w:color="C9D6D3" w:sz="4"/>
             </w:tcBorders>
             <w:tcMar>
               <w:top w:type="dxa" w:w="60"/>
@@ -1066,13 +1173,17 @@
             </w:tcMar>
           </w:tcPr>
           <w:p>
+            <w:pPr>
+              <w:spacing w:after="40"/>
+              <w:jc w:val="left"/>
+            </w:pPr>
             <w:r>
               <w:rPr>
                 <w:rFonts w:ascii="Consolas" w:cs="Consolas" w:eastAsia="Consolas" w:hAnsi="Consolas"/>
                 <w:b w:val="false"/>
                 <w:bCs w:val="false"/>
-                <w:sz w:val="19"/>
-                <w:szCs w:val="19"/>
+                <w:sz w:val="16"/>
+                <w:szCs w:val="16"/>
               </w:rPr>
               <w:t xml:space="preserve">Representacion</w:t>
             </w:r>
@@ -1080,12 +1191,12 @@
         </w:tc>
         <w:tc>
           <w:tcPr>
-            <w:tcW w:type="dxa" w:w="3120"/>
+            <w:tcW w:type="dxa" w:w="3881"/>
             <w:tcBorders>
-              <w:top w:val="single" w:color="BBBBBB" w:sz="4"/>
-              <w:left w:val="single" w:color="BBBBBB" w:sz="4"/>
-              <w:bottom w:val="single" w:color="BBBBBB" w:sz="4"/>
-              <w:right w:val="single" w:color="BBBBBB" w:sz="4"/>
+              <w:top w:val="single" w:color="C9D6D3" w:sz="4"/>
+              <w:left w:val="single" w:color="C9D6D3" w:sz="4"/>
+              <w:bottom w:val="single" w:color="C9D6D3" w:sz="4"/>
+              <w:right w:val="single" w:color="C9D6D3" w:sz="4"/>
             </w:tcBorders>
             <w:tcMar>
               <w:top w:type="dxa" w:w="60"/>
@@ -1095,13 +1206,15 @@
             </w:tcMar>
           </w:tcPr>
           <w:p>
+            <w:pPr>
+              <w:spacing w:after="40"/>
+              <w:jc w:val="left"/>
+            </w:pPr>
             <w:r>
               <w:rPr>
                 <w:rFonts w:ascii="Calibri" w:cs="Calibri" w:eastAsia="Calibri" w:hAnsi="Calibri"/>
-                <w:b w:val="false"/>
-                <w:bCs w:val="false"/>
-                <w:sz w:val="19"/>
-                <w:szCs w:val="19"/>
+                <w:sz w:val="18"/>
+                <w:szCs w:val="18"/>
               </w:rPr>
               <w:t xml:space="preserve">Vínculo verificado entre un menor y su representante legal</w:t>
             </w:r>
@@ -1109,12 +1222,12 @@
         </w:tc>
         <w:tc>
           <w:tcPr>
-            <w:tcW w:type="dxa" w:w="3120"/>
+            <w:tcW w:type="dxa" w:w="4056"/>
             <w:tcBorders>
-              <w:top w:val="single" w:color="BBBBBB" w:sz="4"/>
-              <w:left w:val="single" w:color="BBBBBB" w:sz="4"/>
-              <w:bottom w:val="single" w:color="BBBBBB" w:sz="4"/>
-              <w:right w:val="single" w:color="BBBBBB" w:sz="4"/>
+              <w:top w:val="single" w:color="C9D6D3" w:sz="4"/>
+              <w:left w:val="single" w:color="C9D6D3" w:sz="4"/>
+              <w:bottom w:val="single" w:color="C9D6D3" w:sz="4"/>
+              <w:right w:val="single" w:color="C9D6D3" w:sz="4"/>
             </w:tcBorders>
             <w:tcMar>
               <w:top w:type="dxa" w:w="60"/>
@@ -1124,13 +1237,15 @@
             </w:tcMar>
           </w:tcPr>
           <w:p>
+            <w:pPr>
+              <w:spacing w:after="40"/>
+              <w:jc w:val="left"/>
+            </w:pPr>
             <w:r>
               <w:rPr>
                 <w:rFonts w:ascii="Calibri" w:cs="Calibri" w:eastAsia="Calibri" w:hAnsi="Calibri"/>
-                <w:b w:val="false"/>
-                <w:bCs w:val="false"/>
-                <w:sz w:val="19"/>
-                <w:szCs w:val="19"/>
+                <w:sz w:val="18"/>
+                <w:szCs w:val="18"/>
               </w:rPr>
               <w:t xml:space="preserve">menor, representante, parentesco, estado, documento revisado, quién y cuándo verificó, vigente hasta</w:t>
             </w:r>
@@ -1139,16 +1254,17 @@
       </w:tr>
       <w:tr>
         <w:trPr>
+          <w:cantSplit/>
           <w:tblHeader w:val="off"/>
         </w:trPr>
         <w:tc>
           <w:tcPr>
-            <w:tcW w:type="dxa" w:w="3120"/>
+            <w:tcW w:type="dxa" w:w="2143"/>
             <w:tcBorders>
-              <w:top w:val="single" w:color="BBBBBB" w:sz="4"/>
-              <w:left w:val="single" w:color="BBBBBB" w:sz="4"/>
-              <w:bottom w:val="single" w:color="BBBBBB" w:sz="4"/>
-              <w:right w:val="single" w:color="BBBBBB" w:sz="4"/>
+              <w:top w:val="single" w:color="C9D6D3" w:sz="4"/>
+              <w:left w:val="single" w:color="C9D6D3" w:sz="4"/>
+              <w:bottom w:val="single" w:color="C9D6D3" w:sz="4"/>
+              <w:right w:val="single" w:color="C9D6D3" w:sz="4"/>
             </w:tcBorders>
             <w:tcMar>
               <w:top w:type="dxa" w:w="60"/>
@@ -1158,13 +1274,17 @@
             </w:tcMar>
           </w:tcPr>
           <w:p>
+            <w:pPr>
+              <w:spacing w:after="40"/>
+              <w:jc w:val="left"/>
+            </w:pPr>
             <w:r>
               <w:rPr>
                 <w:rFonts w:ascii="Consolas" w:cs="Consolas" w:eastAsia="Consolas" w:hAnsi="Consolas"/>
                 <w:b w:val="false"/>
                 <w:bCs w:val="false"/>
-                <w:sz w:val="19"/>
-                <w:szCs w:val="19"/>
+                <w:sz w:val="16"/>
+                <w:szCs w:val="16"/>
               </w:rPr>
               <w:t xml:space="preserve">Paciente.aviso_privacidad_version/_en</w:t>
             </w:r>
@@ -1172,12 +1292,12 @@
         </w:tc>
         <w:tc>
           <w:tcPr>
-            <w:tcW w:type="dxa" w:w="3120"/>
+            <w:tcW w:type="dxa" w:w="3881"/>
             <w:tcBorders>
-              <w:top w:val="single" w:color="BBBBBB" w:sz="4"/>
-              <w:left w:val="single" w:color="BBBBBB" w:sz="4"/>
-              <w:bottom w:val="single" w:color="BBBBBB" w:sz="4"/>
-              <w:right w:val="single" w:color="BBBBBB" w:sz="4"/>
+              <w:top w:val="single" w:color="C9D6D3" w:sz="4"/>
+              <w:left w:val="single" w:color="C9D6D3" w:sz="4"/>
+              <w:bottom w:val="single" w:color="C9D6D3" w:sz="4"/>
+              <w:right w:val="single" w:color="C9D6D3" w:sz="4"/>
             </w:tcBorders>
             <w:tcMar>
               <w:top w:type="dxa" w:w="60"/>
@@ -1187,13 +1307,15 @@
             </w:tcMar>
           </w:tcPr>
           <w:p>
+            <w:pPr>
+              <w:spacing w:after="40"/>
+              <w:jc w:val="left"/>
+            </w:pPr>
             <w:r>
               <w:rPr>
                 <w:rFonts w:ascii="Calibri" w:cs="Calibri" w:eastAsia="Calibri" w:hAnsi="Calibri"/>
-                <w:b w:val="false"/>
-                <w:bCs w:val="false"/>
-                <w:sz w:val="19"/>
-                <w:szCs w:val="19"/>
+                <w:sz w:val="18"/>
+                <w:szCs w:val="18"/>
               </w:rPr>
               <w:t xml:space="preserve">Acuse de lectura del aviso (no es consentimiento)</w:t>
             </w:r>
@@ -1201,12 +1323,12 @@
         </w:tc>
         <w:tc>
           <w:tcPr>
-            <w:tcW w:type="dxa" w:w="3120"/>
+            <w:tcW w:type="dxa" w:w="4056"/>
             <w:tcBorders>
-              <w:top w:val="single" w:color="BBBBBB" w:sz="4"/>
-              <w:left w:val="single" w:color="BBBBBB" w:sz="4"/>
-              <w:bottom w:val="single" w:color="BBBBBB" w:sz="4"/>
-              <w:right w:val="single" w:color="BBBBBB" w:sz="4"/>
+              <w:top w:val="single" w:color="C9D6D3" w:sz="4"/>
+              <w:left w:val="single" w:color="C9D6D3" w:sz="4"/>
+              <w:bottom w:val="single" w:color="C9D6D3" w:sz="4"/>
+              <w:right w:val="single" w:color="C9D6D3" w:sz="4"/>
             </w:tcBorders>
             <w:tcMar>
               <w:top w:type="dxa" w:w="60"/>
@@ -1216,13 +1338,15 @@
             </w:tcMar>
           </w:tcPr>
           <w:p>
+            <w:pPr>
+              <w:spacing w:after="40"/>
+              <w:jc w:val="left"/>
+            </w:pPr>
             <w:r>
               <w:rPr>
                 <w:rFonts w:ascii="Calibri" w:cs="Calibri" w:eastAsia="Calibri" w:hAnsi="Calibri"/>
-                <w:b w:val="false"/>
-                <w:bCs w:val="false"/>
-                <w:sz w:val="19"/>
-                <w:szCs w:val="19"/>
+                <w:sz w:val="18"/>
+                <w:szCs w:val="18"/>
               </w:rPr>
               <w:t xml:space="preserve">versión y fecha</w:t>
             </w:r>
@@ -1230,16 +1354,18 @@
         </w:tc>
       </w:tr>
     </w:tbl>
-    <w:p/>
     <w:p>
       <w:pPr>
         <w:spacing w:after="120"/>
       </w:pPr>
-      <w:r>
-        <w:rPr>
-          <w:rFonts w:ascii="Calibri" w:cs="Calibri" w:eastAsia="Calibri" w:hAnsi="Calibri"/>
-          <w:sz w:val="22"/>
-          <w:szCs w:val="22"/>
+    </w:p>
+    <w:p>
+      <w:pPr>
+        <w:spacing w:after="120" w:line="276"/>
+      </w:pPr>
+      <w:r>
+        <w:rPr>
+          <w:rFonts w:ascii="Calibri" w:cs="Calibri" w:eastAsia="Calibri" w:hAnsi="Calibri"/>
         </w:rPr>
         <w:t xml:space="preserve">Lo que se exige de un consentimiento, y dónde queda:</w:t>
       </w:r>
@@ -1251,70 +1377,67 @@
           <w:ilvl w:val="0"/>
           <w:numId w:val="2"/>
         </w:numPr>
+        <w:spacing w:after="60" w:line="264"/>
       </w:pPr>
       <w:r>
         <w:rPr>
           <w:rFonts w:ascii="Calibri" w:cs="Calibri" w:eastAsia="Calibri" w:hAnsi="Calibri"/>
           <w:b/>
           <w:bCs/>
-          <w:sz w:val="22"/>
-          <w:szCs w:val="22"/>
         </w:rPr>
         <w:t xml:space="preserve">Fecha y hora:</w:t>
       </w:r>
       <w:r>
         <w:rPr>
           <w:rFonts w:ascii="Calibri" w:cs="Calibri" w:eastAsia="Calibri" w:hAnsi="Calibri"/>
-          <w:sz w:val="22"/>
-          <w:szCs w:val="22"/>
         </w:rPr>
         <w:t xml:space="preserve"> </w:t>
       </w:r>
       <w:r>
         <w:rPr>
           <w:rFonts w:ascii="Consolas" w:cs="Consolas" w:eastAsia="Consolas" w:hAnsi="Consolas"/>
-          <w:sz w:val="22"/>
-          <w:szCs w:val="22"/>
+          <w:b w:val="false"/>
+          <w:bCs w:val="false"/>
+          <w:sz w:val="19"/>
+          <w:szCs w:val="19"/>
         </w:rPr>
         <w:t xml:space="preserve">otorgado_en</w:t>
       </w:r>
       <w:r>
         <w:rPr>
           <w:rFonts w:ascii="Calibri" w:cs="Calibri" w:eastAsia="Calibri" w:hAnsi="Calibri"/>
-          <w:sz w:val="22"/>
-          <w:szCs w:val="22"/>
         </w:rPr>
         <w:t xml:space="preserve"> / </w:t>
       </w:r>
       <w:r>
         <w:rPr>
           <w:rFonts w:ascii="Consolas" w:cs="Consolas" w:eastAsia="Consolas" w:hAnsi="Consolas"/>
-          <w:sz w:val="22"/>
-          <w:szCs w:val="22"/>
+          <w:b w:val="false"/>
+          <w:bCs w:val="false"/>
+          <w:sz w:val="19"/>
+          <w:szCs w:val="19"/>
         </w:rPr>
         <w:t xml:space="preserve">revocado_en</w:t>
       </w:r>
       <w:r>
         <w:rPr>
           <w:rFonts w:ascii="Calibri" w:cs="Calibri" w:eastAsia="Calibri" w:hAnsi="Calibri"/>
-          <w:sz w:val="22"/>
-          <w:szCs w:val="22"/>
         </w:rPr>
         <w:t xml:space="preserve"> y </w:t>
       </w:r>
       <w:r>
         <w:rPr>
           <w:rFonts w:ascii="Consolas" w:cs="Consolas" w:eastAsia="Consolas" w:hAnsi="Consolas"/>
-          <w:sz w:val="22"/>
-          <w:szCs w:val="22"/>
+          <w:b w:val="false"/>
+          <w:bCs w:val="false"/>
+          <w:sz w:val="19"/>
+          <w:szCs w:val="19"/>
         </w:rPr>
         <w:t xml:space="preserve">RegistroConsentimiento.fecha</w:t>
       </w:r>
       <w:r>
         <w:rPr>
           <w:rFonts w:ascii="Calibri" w:cs="Calibri" w:eastAsia="Calibri" w:hAnsi="Calibri"/>
-          <w:sz w:val="22"/>
-          <w:szCs w:val="22"/>
         </w:rPr>
         <w:t xml:space="preserve">.</w:t>
       </w:r>
@@ -1326,38 +1449,35 @@
           <w:ilvl w:val="0"/>
           <w:numId w:val="2"/>
         </w:numPr>
+        <w:spacing w:after="60" w:line="264"/>
       </w:pPr>
       <w:r>
         <w:rPr>
           <w:rFonts w:ascii="Calibri" w:cs="Calibri" w:eastAsia="Calibri" w:hAnsi="Calibri"/>
           <w:b/>
           <w:bCs/>
-          <w:sz w:val="22"/>
-          <w:szCs w:val="22"/>
         </w:rPr>
         <w:t xml:space="preserve">Finalidad:</w:t>
       </w:r>
       <w:r>
         <w:rPr>
           <w:rFonts w:ascii="Calibri" w:cs="Calibri" w:eastAsia="Calibri" w:hAnsi="Calibri"/>
-          <w:sz w:val="22"/>
-          <w:szCs w:val="22"/>
         </w:rPr>
         <w:t xml:space="preserve"> </w:t>
       </w:r>
       <w:r>
         <w:rPr>
           <w:rFonts w:ascii="Consolas" w:cs="Consolas" w:eastAsia="Consolas" w:hAnsi="Consolas"/>
-          <w:sz w:val="22"/>
-          <w:szCs w:val="22"/>
+          <w:b w:val="false"/>
+          <w:bCs w:val="false"/>
+          <w:sz w:val="19"/>
+          <w:szCs w:val="19"/>
         </w:rPr>
         <w:t xml:space="preserve">Finalidad.codigo</w:t>
       </w:r>
       <w:r>
         <w:rPr>
           <w:rFonts w:ascii="Calibri" w:cs="Calibri" w:eastAsia="Calibri" w:hAnsi="Calibri"/>
-          <w:sz w:val="22"/>
-          <w:szCs w:val="22"/>
         </w:rPr>
         <w:t xml:space="preserve">, una por fila.</w:t>
       </w:r>
@@ -1369,38 +1489,35 @@
           <w:ilvl w:val="0"/>
           <w:numId w:val="2"/>
         </w:numPr>
+        <w:spacing w:after="60" w:line="264"/>
       </w:pPr>
       <w:r>
         <w:rPr>
           <w:rFonts w:ascii="Calibri" w:cs="Calibri" w:eastAsia="Calibri" w:hAnsi="Calibri"/>
           <w:b/>
           <w:bCs/>
-          <w:sz w:val="22"/>
-          <w:szCs w:val="22"/>
         </w:rPr>
         <w:t xml:space="preserve">Versión del texto:</w:t>
       </w:r>
       <w:r>
         <w:rPr>
           <w:rFonts w:ascii="Calibri" w:cs="Calibri" w:eastAsia="Calibri" w:hAnsi="Calibri"/>
-          <w:sz w:val="22"/>
-          <w:szCs w:val="22"/>
         </w:rPr>
         <w:t xml:space="preserve"> </w:t>
       </w:r>
       <w:r>
         <w:rPr>
           <w:rFonts w:ascii="Consolas" w:cs="Consolas" w:eastAsia="Consolas" w:hAnsi="Consolas"/>
-          <w:sz w:val="22"/>
-          <w:szCs w:val="22"/>
+          <w:b w:val="false"/>
+          <w:bCs w:val="false"/>
+          <w:sz w:val="19"/>
+          <w:szCs w:val="19"/>
         </w:rPr>
         <w:t xml:space="preserve">TextoConsentimiento.version</w:t>
       </w:r>
       <w:r>
         <w:rPr>
           <w:rFonts w:ascii="Calibri" w:cs="Calibri" w:eastAsia="Calibri" w:hAnsi="Calibri"/>
-          <w:sz w:val="22"/>
-          <w:szCs w:val="22"/>
         </w:rPr>
         <w:t xml:space="preserve"> y su huella SHA-256. El consentimiento apunta al texto exacto que se aceptó; si el texto cambia, se publica otra versión y la anterior se conserva.</w:t>
       </w:r>
@@ -1412,99 +1529,94 @@
           <w:ilvl w:val="0"/>
           <w:numId w:val="2"/>
         </w:numPr>
+        <w:spacing w:after="60" w:line="264"/>
       </w:pPr>
       <w:r>
         <w:rPr>
           <w:rFonts w:ascii="Calibri" w:cs="Calibri" w:eastAsia="Calibri" w:hAnsi="Calibri"/>
           <w:b/>
           <w:bCs/>
-          <w:sz w:val="22"/>
-          <w:szCs w:val="22"/>
         </w:rPr>
         <w:t xml:space="preserve">Estado:</w:t>
       </w:r>
       <w:r>
         <w:rPr>
           <w:rFonts w:ascii="Calibri" w:cs="Calibri" w:eastAsia="Calibri" w:hAnsi="Calibri"/>
-          <w:sz w:val="22"/>
-          <w:szCs w:val="22"/>
         </w:rPr>
         <w:t xml:space="preserve"> </w:t>
       </w:r>
       <w:r>
         <w:rPr>
           <w:rFonts w:ascii="Consolas" w:cs="Consolas" w:eastAsia="Consolas" w:hAnsi="Consolas"/>
-          <w:sz w:val="22"/>
-          <w:szCs w:val="22"/>
+          <w:b w:val="false"/>
+          <w:bCs w:val="false"/>
+          <w:sz w:val="19"/>
+          <w:szCs w:val="19"/>
         </w:rPr>
         <w:t xml:space="preserve">Consentimiento.estado</w:t>
       </w:r>
       <w:r>
         <w:rPr>
           <w:rFonts w:ascii="Calibri" w:cs="Calibri" w:eastAsia="Calibri" w:hAnsi="Calibri"/>
-          <w:sz w:val="22"/>
-          <w:szCs w:val="22"/>
         </w:rPr>
         <w:t xml:space="preserve">, con el historial completo en </w:t>
       </w:r>
       <w:r>
         <w:rPr>
           <w:rFonts w:ascii="Consolas" w:cs="Consolas" w:eastAsia="Consolas" w:hAnsi="Consolas"/>
-          <w:sz w:val="22"/>
-          <w:szCs w:val="22"/>
+          <w:b w:val="false"/>
+          <w:bCs w:val="false"/>
+          <w:sz w:val="19"/>
+          <w:szCs w:val="19"/>
         </w:rPr>
         <w:t xml:space="preserve">RegistroConsentimiento</w:t>
       </w:r>
       <w:r>
         <w:rPr>
           <w:rFonts w:ascii="Calibri" w:cs="Calibri" w:eastAsia="Calibri" w:hAnsi="Calibri"/>
-          <w:sz w:val="22"/>
-          <w:szCs w:val="22"/>
         </w:rPr>
         <w:t xml:space="preserve">.</w:t>
       </w:r>
     </w:p>
     <w:p>
       <w:pPr>
-        <w:spacing w:after="120"/>
-      </w:pPr>
-      <w:r>
-        <w:rPr>
-          <w:rFonts w:ascii="Calibri" w:cs="Calibri" w:eastAsia="Calibri" w:hAnsi="Calibri"/>
-          <w:sz w:val="22"/>
-          <w:szCs w:val="22"/>
+        <w:spacing w:after="120" w:line="276"/>
+      </w:pPr>
+      <w:r>
+        <w:rPr>
+          <w:rFonts w:ascii="Calibri" w:cs="Calibri" w:eastAsia="Calibri" w:hAnsi="Calibri"/>
         </w:rPr>
         <w:t xml:space="preserve">Inalterabilidad: </w:t>
       </w:r>
       <w:r>
         <w:rPr>
           <w:rFonts w:ascii="Consolas" w:cs="Consolas" w:eastAsia="Consolas" w:hAnsi="Consolas"/>
-          <w:sz w:val="22"/>
-          <w:szCs w:val="22"/>
+          <w:b w:val="false"/>
+          <w:bCs w:val="false"/>
+          <w:sz w:val="19"/>
+          <w:szCs w:val="19"/>
         </w:rPr>
         <w:t xml:space="preserve">TextoConsentimiento</w:t>
       </w:r>
       <w:r>
         <w:rPr>
           <w:rFonts w:ascii="Calibri" w:cs="Calibri" w:eastAsia="Calibri" w:hAnsi="Calibri"/>
-          <w:sz w:val="22"/>
-          <w:szCs w:val="22"/>
         </w:rPr>
         <w:t xml:space="preserve"> y </w:t>
       </w:r>
       <w:r>
         <w:rPr>
           <w:rFonts w:ascii="Consolas" w:cs="Consolas" w:eastAsia="Consolas" w:hAnsi="Consolas"/>
-          <w:sz w:val="22"/>
-          <w:szCs w:val="22"/>
+          <w:b w:val="false"/>
+          <w:bCs w:val="false"/>
+          <w:sz w:val="19"/>
+          <w:szCs w:val="19"/>
         </w:rPr>
         <w:t xml:space="preserve">RegistroConsentimiento</w:t>
       </w:r>
       <w:r>
         <w:rPr>
           <w:rFonts w:ascii="Calibri" w:cs="Calibri" w:eastAsia="Calibri" w:hAnsi="Calibri"/>
-          <w:sz w:val="22"/>
-          <w:szCs w:val="22"/>
         </w:rPr>
         <w:t xml:space="preserve"> lanzan error si se intenta modificar o borrar una fila desde la aplicación. Esto protege contra errores y usos indebidos del código, </w:t>
       </w:r>
@@ -1513,23 +1625,19 @@
           <w:rFonts w:ascii="Calibri" w:cs="Calibri" w:eastAsia="Calibri" w:hAnsi="Calibri"/>
           <w:b/>
           <w:bCs/>
-          <w:sz w:val="22"/>
-          <w:szCs w:val="22"/>
         </w:rPr>
         <w:t xml:space="preserve">no</w:t>
       </w:r>
       <w:r>
         <w:rPr>
           <w:rFonts w:ascii="Calibri" w:cs="Calibri" w:eastAsia="Calibri" w:hAnsi="Calibri"/>
-          <w:sz w:val="22"/>
-          <w:szCs w:val="22"/>
         </w:rPr>
         <w:t xml:space="preserve"> contra alguien con acceso directo a la base de datos; para eso la auditoría registra cada cambio en una cadena con hash (documento 03).</w:t>
       </w:r>
     </w:p>
     <w:p>
       <w:pPr>
-        <w:pStyle w:val="Heading2"/>
+        <w:pStyle w:val="Heading1"/>
       </w:pPr>
       <w:r>
         <w:rPr>
@@ -1545,38 +1653,35 @@
           <w:ilvl w:val="0"/>
           <w:numId w:val="2"/>
         </w:numPr>
+        <w:spacing w:after="60" w:line="264"/>
       </w:pPr>
       <w:r>
         <w:rPr>
           <w:rFonts w:ascii="Calibri" w:cs="Calibri" w:eastAsia="Calibri" w:hAnsi="Calibri"/>
           <w:b/>
           <w:bCs/>
-          <w:sz w:val="22"/>
-          <w:szCs w:val="22"/>
         </w:rPr>
         <w:t xml:space="preserve">Un consentimiento no habilita otro.</w:t>
       </w:r>
       <w:r>
         <w:rPr>
           <w:rFonts w:ascii="Calibri" w:cs="Calibri" w:eastAsia="Calibri" w:hAnsi="Calibri"/>
-          <w:sz w:val="22"/>
-          <w:szCs w:val="22"/>
         </w:rPr>
         <w:t xml:space="preserve"> El estado se guarda por (paciente, finalidad) con una restricción de unicidad, y los procesos consultan una sola función, </w:t>
       </w:r>
       <w:r>
         <w:rPr>
           <w:rFonts w:ascii="Consolas" w:cs="Consolas" w:eastAsia="Consolas" w:hAnsi="Consolas"/>
-          <w:sz w:val="22"/>
-          <w:szCs w:val="22"/>
+          <w:b w:val="false"/>
+          <w:bCs w:val="false"/>
+          <w:sz w:val="19"/>
+          <w:szCs w:val="19"/>
         </w:rPr>
         <w:t xml:space="preserve">vigente(paciente, código)</w:t>
       </w:r>
       <w:r>
         <w:rPr>
           <w:rFonts w:ascii="Calibri" w:cs="Calibri" w:eastAsia="Calibri" w:hAnsi="Calibri"/>
-          <w:sz w:val="22"/>
-          <w:szCs w:val="22"/>
         </w:rPr>
         <w:t xml:space="preserve">. Dar el permiso del correo no activa el SMS, y ningún permiso de recordatorios habilita otro uso futuro (marketing, investigación): serían otras finalidades, con su propio texto y su propia decisión. Esto responde al principio de finalidad: cada permiso cubre únicamente el propósito que se explicó.</w:t>
       </w:r>
@@ -1588,22 +1693,19 @@
           <w:ilvl w:val="0"/>
           <w:numId w:val="2"/>
         </w:numPr>
+        <w:spacing w:after="60" w:line="264"/>
       </w:pPr>
       <w:r>
         <w:rPr>
           <w:rFonts w:ascii="Calibri" w:cs="Calibri" w:eastAsia="Calibri" w:hAnsi="Calibri"/>
           <w:b/>
           <w:bCs/>
-          <w:sz w:val="22"/>
-          <w:szCs w:val="22"/>
         </w:rPr>
         <w:t xml:space="preserve">Revocar es tan fácil como otorgar.</w:t>
       </w:r>
       <w:r>
         <w:rPr>
           <w:rFonts w:ascii="Calibri" w:cs="Calibri" w:eastAsia="Calibri" w:hAnsi="Calibri"/>
-          <w:sz w:val="22"/>
-          <w:szCs w:val="22"/>
         </w:rPr>
         <w:t xml:space="preserve"> Un clic en "Mis consentimientos". Revocar deja fecha y hora, no pide justificación y no afecta la atención.</w:t>
       </w:r>
@@ -1615,38 +1717,35 @@
           <w:ilvl w:val="0"/>
           <w:numId w:val="2"/>
         </w:numPr>
+        <w:spacing w:after="60" w:line="264"/>
       </w:pPr>
       <w:r>
         <w:rPr>
           <w:rFonts w:ascii="Calibri" w:cs="Calibri" w:eastAsia="Calibri" w:hAnsi="Calibri"/>
           <w:b/>
           <w:bCs/>
-          <w:sz w:val="22"/>
-          <w:szCs w:val="22"/>
         </w:rPr>
         <w:t xml:space="preserve">Reconfirmación.</w:t>
       </w:r>
       <w:r>
         <w:rPr>
           <w:rFonts w:ascii="Calibri" w:cs="Calibri" w:eastAsia="Calibri" w:hAnsi="Calibri"/>
-          <w:sz w:val="22"/>
-          <w:szCs w:val="22"/>
         </w:rPr>
         <w:t xml:space="preserve"> Si cambia el alcance de un texto, se publica una versión nueva y se sube </w:t>
       </w:r>
       <w:r>
         <w:rPr>
           <w:rFonts w:ascii="Consolas" w:cs="Consolas" w:eastAsia="Consolas" w:hAnsi="Consolas"/>
-          <w:sz w:val="22"/>
-          <w:szCs w:val="22"/>
+          <w:b w:val="false"/>
+          <w:bCs w:val="false"/>
+          <w:sz w:val="19"/>
+          <w:szCs w:val="19"/>
         </w:rPr>
         <w:t xml:space="preserve">version_minima_valida</w:t>
       </w:r>
       <w:r>
         <w:rPr>
           <w:rFonts w:ascii="Calibri" w:cs="Calibri" w:eastAsia="Calibri" w:hAnsi="Calibri"/>
-          <w:sz w:val="22"/>
-          <w:szCs w:val="22"/>
         </w:rPr>
         <w:t xml:space="preserve">: los consentimientos dados con textos anteriores dejan de valer hasta que el paciente los confirme otra vez, y la pantalla lo muestra como "Hay que reconfirmar".</w:t>
       </w:r>
@@ -1658,22 +1757,19 @@
           <w:ilvl w:val="0"/>
           <w:numId w:val="2"/>
         </w:numPr>
+        <w:spacing w:after="60" w:line="264"/>
       </w:pPr>
       <w:r>
         <w:rPr>
           <w:rFonts w:ascii="Calibri" w:cs="Calibri" w:eastAsia="Calibri" w:hAnsi="Calibri"/>
           <w:b/>
           <w:bCs/>
-          <w:sz w:val="22"/>
-          <w:szCs w:val="22"/>
         </w:rPr>
         <w:t xml:space="preserve">No se ensucia el historial.</w:t>
       </w:r>
       <w:r>
         <w:rPr>
           <w:rFonts w:ascii="Calibri" w:cs="Calibri" w:eastAsia="Calibri" w:hAnsi="Calibri"/>
-          <w:sz w:val="22"/>
-          <w:szCs w:val="22"/>
         </w:rPr>
         <w:t xml:space="preserve"> Repetir una acción que no cambia nada (otorgar lo ya otorgado, revocar lo no otorgado) no genera filas.</w:t>
       </w:r>
@@ -1685,29 +1781,26 @@
           <w:ilvl w:val="0"/>
           <w:numId w:val="2"/>
         </w:numPr>
+        <w:spacing w:after="60" w:line="264"/>
       </w:pPr>
       <w:r>
         <w:rPr>
           <w:rFonts w:ascii="Calibri" w:cs="Calibri" w:eastAsia="Calibri" w:hAnsi="Calibri"/>
           <w:b/>
           <w:bCs/>
-          <w:sz w:val="22"/>
-          <w:szCs w:val="22"/>
         </w:rPr>
         <w:t xml:space="preserve">Pacientes con datos bloqueados</w:t>
       </w:r>
       <w:r>
         <w:rPr>
           <w:rFonts w:ascii="Calibri" w:cs="Calibri" w:eastAsia="Calibri" w:hAnsi="Calibri"/>
-          <w:sz w:val="22"/>
-          <w:szCs w:val="22"/>
         </w:rPr>
         <w:t xml:space="preserve"> por una supresión no pueden dar consentimientos nuevos.</w:t>
       </w:r>
     </w:p>
     <w:p>
       <w:pPr>
-        <w:pStyle w:val="Heading2"/>
+        <w:pStyle w:val="Heading1"/>
       </w:pPr>
       <w:r>
         <w:rPr>
@@ -1718,60 +1811,60 @@
     </w:p>
     <w:p>
       <w:pPr>
-        <w:spacing w:after="120"/>
-      </w:pPr>
-      <w:r>
-        <w:rPr>
-          <w:rFonts w:ascii="Calibri" w:cs="Calibri" w:eastAsia="Calibri" w:hAnsi="Calibri"/>
-          <w:sz w:val="22"/>
-          <w:szCs w:val="22"/>
+        <w:spacing w:after="120" w:line="276"/>
+      </w:pPr>
+      <w:r>
+        <w:rPr>
+          <w:rFonts w:ascii="Calibri" w:cs="Calibri" w:eastAsia="Calibri" w:hAnsi="Calibri"/>
         </w:rPr>
         <w:t xml:space="preserve">La revocación se aplica en tres puntos, porque revisar solo uno dejaría una ventana:</w:t>
       </w:r>
     </w:p>
     <w:p>
       <w:pPr>
-        <w:spacing w:after="120"/>
-      </w:pPr>
-      <w:r>
-        <w:rPr>
-          <w:rFonts w:ascii="Calibri" w:cs="Calibri" w:eastAsia="Calibri" w:hAnsi="Calibri"/>
-          <w:sz w:val="22"/>
-          <w:szCs w:val="22"/>
-        </w:rPr>
-        <w:t xml:space="preserve">1. </w:t>
+        <w:pStyle w:val="ListParagraph"/>
+        <w:tabs>
+          <w:tab w:val="left" w:pos="720"/>
+        </w:tabs>
+        <w:spacing w:after="60" w:line="264"/>
+        <w:ind w:left="720" w:hanging="360"/>
+      </w:pPr>
+      <w:r>
+        <w:rPr>
+          <w:rFonts w:ascii="Calibri" w:cs="Calibri" w:eastAsia="Calibri" w:hAnsi="Calibri"/>
+        </w:rPr>
+        <w:t xml:space="preserve">1.</w:t>
+      </w:r>
+      <w:r>
+        <w:tab/>
       </w:r>
       <w:r>
         <w:rPr>
           <w:rFonts w:ascii="Calibri" w:cs="Calibri" w:eastAsia="Calibri" w:hAnsi="Calibri"/>
           <w:b/>
           <w:bCs/>
-          <w:sz w:val="22"/>
-          <w:szCs w:val="22"/>
         </w:rPr>
         <w:t xml:space="preserve">Al generar recordatorios</w:t>
       </w:r>
       <w:r>
         <w:rPr>
           <w:rFonts w:ascii="Calibri" w:cs="Calibri" w:eastAsia="Calibri" w:hAnsi="Calibri"/>
-          <w:sz w:val="22"/>
-          <w:szCs w:val="22"/>
         </w:rPr>
         <w:t xml:space="preserve"> (</w:t>
       </w:r>
       <w:r>
         <w:rPr>
           <w:rFonts w:ascii="Consolas" w:cs="Consolas" w:eastAsia="Consolas" w:hAnsi="Consolas"/>
-          <w:sz w:val="22"/>
-          <w:szCs w:val="22"/>
+          <w:b w:val="false"/>
+          <w:bCs w:val="false"/>
+          <w:sz w:val="19"/>
+          <w:szCs w:val="19"/>
         </w:rPr>
         <w:t xml:space="preserve">recordatorios.generar</w:t>
       </w:r>
       <w:r>
         <w:rPr>
           <w:rFonts w:ascii="Calibri" w:cs="Calibri" w:eastAsia="Calibri" w:hAnsi="Calibri"/>
-          <w:sz w:val="22"/>
-          <w:szCs w:val="22"/>
         </w:rPr>
         <w:t xml:space="preserve">): un canal solo sale si la regla lo usa, el paciente lo prefiere </w:t>
       </w:r>
@@ -1780,123 +1873,121 @@
           <w:rFonts w:ascii="Calibri" w:cs="Calibri" w:eastAsia="Calibri" w:hAnsi="Calibri"/>
           <w:b/>
           <w:bCs/>
-          <w:sz w:val="22"/>
-          <w:szCs w:val="22"/>
         </w:rPr>
         <w:t xml:space="preserve">y</w:t>
       </w:r>
       <w:r>
         <w:rPr>
           <w:rFonts w:ascii="Calibri" w:cs="Calibri" w:eastAsia="Calibri" w:hAnsi="Calibri"/>
-          <w:sz w:val="22"/>
-          <w:szCs w:val="22"/>
         </w:rPr>
         <w:t xml:space="preserve"> hay consentimiento vigente para ese canal.</w:t>
       </w:r>
     </w:p>
     <w:p>
       <w:pPr>
-        <w:spacing w:after="120"/>
-      </w:pPr>
-      <w:r>
-        <w:rPr>
-          <w:rFonts w:ascii="Calibri" w:cs="Calibri" w:eastAsia="Calibri" w:hAnsi="Calibri"/>
-          <w:sz w:val="22"/>
-          <w:szCs w:val="22"/>
-        </w:rPr>
-        <w:t xml:space="preserve">2. </w:t>
+        <w:pStyle w:val="ListParagraph"/>
+        <w:tabs>
+          <w:tab w:val="left" w:pos="720"/>
+        </w:tabs>
+        <w:spacing w:after="60" w:line="264"/>
+        <w:ind w:left="720" w:hanging="360"/>
+      </w:pPr>
+      <w:r>
+        <w:rPr>
+          <w:rFonts w:ascii="Calibri" w:cs="Calibri" w:eastAsia="Calibri" w:hAnsi="Calibri"/>
+        </w:rPr>
+        <w:t xml:space="preserve">2.</w:t>
+      </w:r>
+      <w:r>
+        <w:tab/>
       </w:r>
       <w:r>
         <w:rPr>
           <w:rFonts w:ascii="Calibri" w:cs="Calibri" w:eastAsia="Calibri" w:hAnsi="Calibri"/>
           <w:b/>
           <w:bCs/>
-          <w:sz w:val="22"/>
-          <w:szCs w:val="22"/>
         </w:rPr>
         <w:t xml:space="preserve">Al enviar</w:t>
       </w:r>
       <w:r>
         <w:rPr>
           <w:rFonts w:ascii="Calibri" w:cs="Calibri" w:eastAsia="Calibri" w:hAnsi="Calibri"/>
-          <w:sz w:val="22"/>
-          <w:szCs w:val="22"/>
         </w:rPr>
         <w:t xml:space="preserve"> (</w:t>
       </w:r>
       <w:r>
         <w:rPr>
           <w:rFonts w:ascii="Consolas" w:cs="Consolas" w:eastAsia="Consolas" w:hAnsi="Consolas"/>
-          <w:sz w:val="22"/>
-          <w:szCs w:val="22"/>
+          <w:b w:val="false"/>
+          <w:bCs w:val="false"/>
+          <w:sz w:val="19"/>
+          <w:szCs w:val="19"/>
         </w:rPr>
         <w:t xml:space="preserve">recordatorios.enviar_pendientes</w:t>
       </w:r>
       <w:r>
         <w:rPr>
           <w:rFonts w:ascii="Calibri" w:cs="Calibri" w:eastAsia="Calibri" w:hAnsi="Calibri"/>
-          <w:sz w:val="22"/>
-          <w:szCs w:val="22"/>
         </w:rPr>
         <w:t xml:space="preserve">): se revisa de nuevo. Si el paciente revocó después de que el recordatorio se generó, este pasa a estado </w:t>
       </w:r>
       <w:r>
         <w:rPr>
           <w:rFonts w:ascii="Consolas" w:cs="Consolas" w:eastAsia="Consolas" w:hAnsi="Consolas"/>
-          <w:sz w:val="22"/>
-          <w:szCs w:val="22"/>
+          <w:b w:val="false"/>
+          <w:bCs w:val="false"/>
+          <w:sz w:val="19"/>
+          <w:szCs w:val="19"/>
         </w:rPr>
         <w:t xml:space="preserve">CANCELADO</w:t>
       </w:r>
       <w:r>
         <w:rPr>
           <w:rFonts w:ascii="Calibri" w:cs="Calibri" w:eastAsia="Calibri" w:hAnsi="Calibri"/>
-          <w:sz w:val="22"/>
-          <w:szCs w:val="22"/>
         </w:rPr>
         <w:t xml:space="preserve"> ("Sin consentimiento vigente") y no se envía. Es la parte más importante: sin ella, un aviso ya programado seguiría saliendo.</w:t>
       </w:r>
     </w:p>
     <w:p>
       <w:pPr>
-        <w:spacing w:after="120"/>
-      </w:pPr>
-      <w:r>
-        <w:rPr>
-          <w:rFonts w:ascii="Calibri" w:cs="Calibri" w:eastAsia="Calibri" w:hAnsi="Calibri"/>
-          <w:sz w:val="22"/>
-          <w:szCs w:val="22"/>
-        </w:rPr>
-        <w:t xml:space="preserve">3. </w:t>
+        <w:pStyle w:val="ListParagraph"/>
+        <w:tabs>
+          <w:tab w:val="left" w:pos="720"/>
+        </w:tabs>
+        <w:spacing w:after="60" w:line="264"/>
+        <w:ind w:left="720" w:hanging="360"/>
+      </w:pPr>
+      <w:r>
+        <w:rPr>
+          <w:rFonts w:ascii="Calibri" w:cs="Calibri" w:eastAsia="Calibri" w:hAnsi="Calibri"/>
+        </w:rPr>
+        <w:t xml:space="preserve">3.</w:t>
+      </w:r>
+      <w:r>
+        <w:tab/>
       </w:r>
       <w:r>
         <w:rPr>
           <w:rFonts w:ascii="Calibri" w:cs="Calibri" w:eastAsia="Calibri" w:hAnsi="Calibri"/>
           <w:b/>
           <w:bCs/>
-          <w:sz w:val="22"/>
-          <w:szCs w:val="22"/>
         </w:rPr>
         <w:t xml:space="preserve">En las preferencias del portal:</w:t>
       </w:r>
       <w:r>
         <w:rPr>
           <w:rFonts w:ascii="Calibri" w:cs="Calibri" w:eastAsia="Calibri" w:hAnsi="Calibri"/>
-          <w:sz w:val="22"/>
-          <w:szCs w:val="22"/>
         </w:rPr>
         <w:t xml:space="preserve"> no se puede activar un canal sin consentimiento; el servidor lo rechaza con un mensaje, aunque alguien fabrique la petición a mano. Las preferencias iniciales de un paciente nuevo parten de los canales que consintió.</w:t>
       </w:r>
     </w:p>
     <w:p>
       <w:pPr>
-        <w:spacing w:after="120"/>
-      </w:pPr>
-      <w:r>
-        <w:rPr>
-          <w:rFonts w:ascii="Calibri" w:cs="Calibri" w:eastAsia="Calibri" w:hAnsi="Calibri"/>
-          <w:sz w:val="22"/>
-          <w:szCs w:val="22"/>
+        <w:spacing w:after="120" w:line="276"/>
+      </w:pPr>
+      <w:r>
+        <w:rPr>
+          <w:rFonts w:ascii="Calibri" w:cs="Calibri" w:eastAsia="Calibri" w:hAnsi="Calibri"/>
         </w:rPr>
         <w:t xml:space="preserve">Lo que la revocación </w:t>
       </w:r>
@@ -1905,23 +1996,19 @@
           <w:rFonts w:ascii="Calibri" w:cs="Calibri" w:eastAsia="Calibri" w:hAnsi="Calibri"/>
           <w:b/>
           <w:bCs/>
-          <w:sz w:val="22"/>
-          <w:szCs w:val="22"/>
         </w:rPr>
         <w:t xml:space="preserve">no</w:t>
       </w:r>
       <w:r>
         <w:rPr>
           <w:rFonts w:ascii="Calibri" w:cs="Calibri" w:eastAsia="Calibri" w:hAnsi="Calibri"/>
-          <w:sz w:val="22"/>
-          <w:szCs w:val="22"/>
         </w:rPr>
         <w:t xml:space="preserve"> cambia: citas, ficha, recetas y resultados, porque no dependen de este consentimiento. El aviso de la propia cuenta del portal (notificación interna) tampoco, porque no usa correo ni teléfono.</w:t>
       </w:r>
     </w:p>
     <w:p>
       <w:pPr>
-        <w:pStyle w:val="Heading2"/>
+        <w:pStyle w:val="Heading1"/>
       </w:pPr>
       <w:r>
         <w:rPr>
@@ -1932,13 +2019,11 @@
     </w:p>
     <w:p>
       <w:pPr>
-        <w:spacing w:after="120"/>
-      </w:pPr>
-      <w:r>
-        <w:rPr>
-          <w:rFonts w:ascii="Calibri" w:cs="Calibri" w:eastAsia="Calibri" w:hAnsi="Calibri"/>
-          <w:sz w:val="22"/>
-          <w:szCs w:val="22"/>
+        <w:spacing w:after="120" w:line="276"/>
+      </w:pPr>
+      <w:r>
+        <w:rPr>
+          <w:rFonts w:ascii="Calibri" w:cs="Calibri" w:eastAsia="Calibri" w:hAnsi="Calibri"/>
         </w:rPr>
         <w:t xml:space="preserve">El historial responde "quién decidió qué, sobre qué texto y cuándo" y nada más. </w:t>
       </w:r>
@@ -1947,23 +2032,19 @@
           <w:rFonts w:ascii="Calibri" w:cs="Calibri" w:eastAsia="Calibri" w:hAnsi="Calibri"/>
           <w:b/>
           <w:bCs/>
-          <w:sz w:val="22"/>
-          <w:szCs w:val="22"/>
         </w:rPr>
         <w:t xml:space="preserve">No se guardan</w:t>
       </w:r>
       <w:r>
         <w:rPr>
           <w:rFonts w:ascii="Calibri" w:cs="Calibri" w:eastAsia="Calibri" w:hAnsi="Calibri"/>
-          <w:sz w:val="22"/>
-          <w:szCs w:val="22"/>
         </w:rPr>
         <w:t xml:space="preserve">: direcciones IP, agente de navegador, copia del correo o del teléfono, ni el texto en claro dentro de la auditoría (solo el código de finalidad, la versión y el estado). El paciente aparece por su código seudónimo. Los eventos de auditoría de consentimiento llevan finalidad, estado anterior, estado nuevo, versión y canal de origen (portal, migración de datos anteriores o supresión por derechos). La pantalla del Encargado de privacidad muestra cifras y movimientos con códigos seudónimos, nunca nombres.</w:t>
       </w:r>
     </w:p>
     <w:p>
       <w:pPr>
-        <w:pStyle w:val="Heading2"/>
+        <w:pStyle w:val="Heading1"/>
       </w:pPr>
       <w:r>
         <w:rPr>
@@ -1974,13 +2055,11 @@
     </w:p>
     <w:p>
       <w:pPr>
-        <w:spacing w:after="120"/>
-      </w:pPr>
-      <w:r>
-        <w:rPr>
-          <w:rFonts w:ascii="Calibri" w:cs="Calibri" w:eastAsia="Calibri" w:hAnsi="Calibri"/>
-          <w:sz w:val="22"/>
-          <w:szCs w:val="22"/>
+        <w:spacing w:after="120" w:line="276"/>
+      </w:pPr>
+      <w:r>
+        <w:rPr>
+          <w:rFonts w:ascii="Calibri" w:cs="Calibri" w:eastAsia="Calibri" w:hAnsi="Calibri"/>
         </w:rPr>
         <w:t xml:space="preserve">Aplica porque el centro atiende menores. Regla adoptada: </w:t>
       </w:r>
@@ -1989,254 +2068,308 @@
           <w:rFonts w:ascii="Calibri" w:cs="Calibri" w:eastAsia="Calibri" w:hAnsi="Calibri"/>
           <w:b/>
           <w:bCs/>
-          <w:sz w:val="22"/>
-          <w:szCs w:val="22"/>
         </w:rPr>
         <w:t xml:space="preserve">hasta los 18 años el consentimiento lo da el representante legal.</w:t>
       </w:r>
     </w:p>
     <w:p>
       <w:pPr>
-        <w:spacing w:after="120"/>
-      </w:pPr>
-      <w:r>
-        <w:rPr>
-          <w:rFonts w:ascii="Calibri" w:cs="Calibri" w:eastAsia="Calibri" w:hAnsi="Calibri"/>
-          <w:sz w:val="22"/>
-          <w:szCs w:val="22"/>
-        </w:rPr>
-        <w:t xml:space="preserve">1. El registro público rechaza a menores: la cuenta de un menor la crea su representante.</w:t>
-      </w:r>
-    </w:p>
-    <w:p>
-      <w:pPr>
-        <w:spacing w:after="120"/>
-      </w:pPr>
-      <w:r>
-        <w:rPr>
-          <w:rFonts w:ascii="Calibri" w:cs="Calibri" w:eastAsia="Calibri" w:hAnsi="Calibri"/>
-          <w:sz w:val="22"/>
-          <w:szCs w:val="22"/>
-        </w:rPr>
-        <w:t xml:space="preserve">2. En recepción, el representante acredita en persona el vínculo (certificado de nacimiento, resolución judicial u otro documento legal). El personal registra </w:t>
+        <w:pStyle w:val="ListParagraph"/>
+        <w:tabs>
+          <w:tab w:val="left" w:pos="720"/>
+        </w:tabs>
+        <w:spacing w:after="60" w:line="264"/>
+        <w:ind w:left="720" w:hanging="360"/>
+      </w:pPr>
+      <w:r>
+        <w:rPr>
+          <w:rFonts w:ascii="Calibri" w:cs="Calibri" w:eastAsia="Calibri" w:hAnsi="Calibri"/>
+        </w:rPr>
+        <w:t xml:space="preserve">1.</w:t>
+      </w:r>
+      <w:r>
+        <w:tab/>
+      </w:r>
+      <w:r>
+        <w:rPr>
+          <w:rFonts w:ascii="Calibri" w:cs="Calibri" w:eastAsia="Calibri" w:hAnsi="Calibri"/>
+        </w:rPr>
+        <w:t xml:space="preserve">El registro público rechaza a menores: un menor no crea cuenta propia. Su ficha puede existir sin cuenta (la abre el médico) y quien actúa en su nombre es su representante, desde su propia cuenta.</w:t>
+      </w:r>
+    </w:p>
+    <w:p>
+      <w:pPr>
+        <w:pStyle w:val="ListParagraph"/>
+        <w:tabs>
+          <w:tab w:val="left" w:pos="720"/>
+        </w:tabs>
+        <w:spacing w:after="60" w:line="264"/>
+        <w:ind w:left="720" w:hanging="360"/>
+      </w:pPr>
+      <w:r>
+        <w:rPr>
+          <w:rFonts w:ascii="Calibri" w:cs="Calibri" w:eastAsia="Calibri" w:hAnsi="Calibri"/>
+        </w:rPr>
+        <w:t xml:space="preserve">2.</w:t>
+      </w:r>
+      <w:r>
+        <w:tab/>
+      </w:r>
+      <w:r>
+        <w:rPr>
+          <w:rFonts w:ascii="Calibri" w:cs="Calibri" w:eastAsia="Calibri" w:hAnsi="Calibri"/>
+        </w:rPr>
+        <w:t xml:space="preserve">En recepción, el representante acredita en persona el vínculo (certificado de nacimiento, resolución judicial u otro documento legal). El personal registra </w:t>
       </w:r>
       <w:r>
         <w:rPr>
           <w:rFonts w:ascii="Calibri" w:cs="Calibri" w:eastAsia="Calibri" w:hAnsi="Calibri"/>
           <w:b/>
           <w:bCs/>
-          <w:sz w:val="22"/>
-          <w:szCs w:val="22"/>
         </w:rPr>
         <w:t xml:space="preserve">qué documento revisó</w:t>
       </w:r>
       <w:r>
         <w:rPr>
           <w:rFonts w:ascii="Calibri" w:cs="Calibri" w:eastAsia="Calibri" w:hAnsi="Calibri"/>
-          <w:sz w:val="22"/>
-          <w:szCs w:val="22"/>
         </w:rPr>
         <w:t xml:space="preserve">, quién verificó y cuándo; no se escanea ni se guarda copia. Ambas personas deben existir como pacientes.</w:t>
       </w:r>
     </w:p>
     <w:p>
       <w:pPr>
-        <w:spacing w:after="120"/>
-      </w:pPr>
-      <w:r>
-        <w:rPr>
-          <w:rFonts w:ascii="Calibri" w:cs="Calibri" w:eastAsia="Calibri" w:hAnsi="Calibri"/>
-          <w:sz w:val="22"/>
-          <w:szCs w:val="22"/>
-        </w:rPr>
-        <w:t xml:space="preserve">3. La representación nace </w:t>
+        <w:pStyle w:val="ListParagraph"/>
+        <w:tabs>
+          <w:tab w:val="left" w:pos="720"/>
+        </w:tabs>
+        <w:spacing w:after="60" w:line="264"/>
+        <w:ind w:left="720" w:hanging="360"/>
+      </w:pPr>
+      <w:r>
+        <w:rPr>
+          <w:rFonts w:ascii="Calibri" w:cs="Calibri" w:eastAsia="Calibri" w:hAnsi="Calibri"/>
+        </w:rPr>
+        <w:t xml:space="preserve">3.</w:t>
+      </w:r>
+      <w:r>
+        <w:tab/>
+      </w:r>
+      <w:r>
+        <w:rPr>
+          <w:rFonts w:ascii="Calibri" w:cs="Calibri" w:eastAsia="Calibri" w:hAnsi="Calibri"/>
+        </w:rPr>
+        <w:t xml:space="preserve">La representación nace </w:t>
       </w:r>
       <w:r>
         <w:rPr>
           <w:rFonts w:ascii="Consolas" w:cs="Consolas" w:eastAsia="Consolas" w:hAnsi="Consolas"/>
-          <w:sz w:val="22"/>
-          <w:szCs w:val="22"/>
+          <w:b w:val="false"/>
+          <w:bCs w:val="false"/>
+          <w:sz w:val="19"/>
+          <w:szCs w:val="19"/>
         </w:rPr>
         <w:t xml:space="preserve">VERIFICADA</w:t>
       </w:r>
       <w:r>
         <w:rPr>
           <w:rFonts w:ascii="Calibri" w:cs="Calibri" w:eastAsia="Calibri" w:hAnsi="Calibri"/>
-          <w:sz w:val="22"/>
-          <w:szCs w:val="22"/>
         </w:rPr>
         <w:t xml:space="preserve"> con una fecha </w:t>
       </w:r>
       <w:r>
         <w:rPr>
           <w:rFonts w:ascii="Consolas" w:cs="Consolas" w:eastAsia="Consolas" w:hAnsi="Consolas"/>
-          <w:sz w:val="22"/>
-          <w:szCs w:val="22"/>
+          <w:b w:val="false"/>
+          <w:bCs w:val="false"/>
+          <w:sz w:val="19"/>
+          <w:szCs w:val="19"/>
         </w:rPr>
         <w:t xml:space="preserve">vigente_hasta</w:t>
       </w:r>
       <w:r>
         <w:rPr>
           <w:rFonts w:ascii="Calibri" w:cs="Calibri" w:eastAsia="Calibri" w:hAnsi="Calibri"/>
-          <w:sz w:val="22"/>
-          <w:szCs w:val="22"/>
         </w:rPr>
         <w:t xml:space="preserve"> (el día que el menor cumple 18). Recepción puede terminarla antes.</w:t>
       </w:r>
     </w:p>
     <w:p>
       <w:pPr>
-        <w:spacing w:after="120"/>
-      </w:pPr>
-      <w:r>
-        <w:rPr>
-          <w:rFonts w:ascii="Calibri" w:cs="Calibri" w:eastAsia="Calibri" w:hAnsi="Calibri"/>
-          <w:sz w:val="22"/>
-          <w:szCs w:val="22"/>
-        </w:rPr>
-        <w:t xml:space="preserve">4. El representante ve a su representado en "Mis consentimientos" y decide por él. Cada registro guarda </w:t>
+        <w:pStyle w:val="ListParagraph"/>
+        <w:tabs>
+          <w:tab w:val="left" w:pos="720"/>
+        </w:tabs>
+        <w:spacing w:after="60" w:line="264"/>
+        <w:ind w:left="720" w:hanging="360"/>
+      </w:pPr>
+      <w:r>
+        <w:rPr>
+          <w:rFonts w:ascii="Calibri" w:cs="Calibri" w:eastAsia="Calibri" w:hAnsi="Calibri"/>
+        </w:rPr>
+        <w:t xml:space="preserve">4.</w:t>
+      </w:r>
+      <w:r>
+        <w:tab/>
+      </w:r>
+      <w:r>
+        <w:rPr>
+          <w:rFonts w:ascii="Calibri" w:cs="Calibri" w:eastAsia="Calibri" w:hAnsi="Calibri"/>
+        </w:rPr>
+        <w:t xml:space="preserve">El representante ve a su representado en "Mis consentimientos" y decide por él. Cada registro guarda </w:t>
       </w:r>
       <w:r>
         <w:rPr>
           <w:rFonts w:ascii="Consolas" w:cs="Consolas" w:eastAsia="Consolas" w:hAnsi="Consolas"/>
-          <w:sz w:val="22"/>
-          <w:szCs w:val="22"/>
+          <w:b w:val="false"/>
+          <w:bCs w:val="false"/>
+          <w:sz w:val="19"/>
+          <w:szCs w:val="19"/>
         </w:rPr>
         <w:t xml:space="preserve">otorgante = REPRESENTANTE</w:t>
       </w:r>
       <w:r>
         <w:rPr>
           <w:rFonts w:ascii="Calibri" w:cs="Calibri" w:eastAsia="Calibri" w:hAnsi="Calibri"/>
-          <w:sz w:val="22"/>
-          <w:szCs w:val="22"/>
         </w:rPr>
         <w:t xml:space="preserve"> y la representación usada.</w:t>
       </w:r>
     </w:p>
     <w:p>
       <w:pPr>
-        <w:spacing w:after="120"/>
-      </w:pPr>
-      <w:r>
-        <w:rPr>
-          <w:rFonts w:ascii="Calibri" w:cs="Calibri" w:eastAsia="Calibri" w:hAnsi="Calibri"/>
-          <w:sz w:val="22"/>
-          <w:szCs w:val="22"/>
-        </w:rPr>
-        <w:t xml:space="preserve">5. Un menor no puede consentir por sí mismo, y un tercero sin representación vigente es rechazado y deja un evento </w:t>
+        <w:pStyle w:val="ListParagraph"/>
+        <w:tabs>
+          <w:tab w:val="left" w:pos="720"/>
+        </w:tabs>
+        <w:spacing w:after="60" w:line="264"/>
+        <w:ind w:left="720" w:hanging="360"/>
+      </w:pPr>
+      <w:r>
+        <w:rPr>
+          <w:rFonts w:ascii="Calibri" w:cs="Calibri" w:eastAsia="Calibri" w:hAnsi="Calibri"/>
+        </w:rPr>
+        <w:t xml:space="preserve">5.</w:t>
+      </w:r>
+      <w:r>
+        <w:tab/>
+      </w:r>
+      <w:r>
+        <w:rPr>
+          <w:rFonts w:ascii="Calibri" w:cs="Calibri" w:eastAsia="Calibri" w:hAnsi="Calibri"/>
+        </w:rPr>
+        <w:t xml:space="preserve">Un menor no puede consentir por sí mismo, y un tercero sin representación vigente es rechazado y deja un evento </w:t>
       </w:r>
       <w:r>
         <w:rPr>
           <w:rFonts w:ascii="Consolas" w:cs="Consolas" w:eastAsia="Consolas" w:hAnsi="Consolas"/>
-          <w:sz w:val="22"/>
-          <w:szCs w:val="22"/>
+          <w:b w:val="false"/>
+          <w:bCs w:val="false"/>
+          <w:sz w:val="19"/>
+          <w:szCs w:val="19"/>
         </w:rPr>
         <w:t xml:space="preserve">DENEGADO</w:t>
       </w:r>
       <w:r>
         <w:rPr>
           <w:rFonts w:ascii="Calibri" w:cs="Calibri" w:eastAsia="Calibri" w:hAnsi="Calibri"/>
-          <w:sz w:val="22"/>
-          <w:szCs w:val="22"/>
         </w:rPr>
         <w:t xml:space="preserve"> en la auditoría.</w:t>
       </w:r>
     </w:p>
     <w:p>
       <w:pPr>
-        <w:spacing w:after="120"/>
-      </w:pPr>
-      <w:r>
-        <w:rPr>
-          <w:rFonts w:ascii="Calibri" w:cs="Calibri" w:eastAsia="Calibri" w:hAnsi="Calibri"/>
-          <w:sz w:val="22"/>
-          <w:szCs w:val="22"/>
-        </w:rPr>
-        <w:t xml:space="preserve">6. </w:t>
+        <w:pStyle w:val="ListParagraph"/>
+        <w:tabs>
+          <w:tab w:val="left" w:pos="720"/>
+        </w:tabs>
+        <w:spacing w:after="60" w:line="264"/>
+        <w:ind w:left="720" w:hanging="360"/>
+      </w:pPr>
+      <w:r>
+        <w:rPr>
+          <w:rFonts w:ascii="Calibri" w:cs="Calibri" w:eastAsia="Calibri" w:hAnsi="Calibri"/>
+        </w:rPr>
+        <w:t xml:space="preserve">6.</w:t>
+      </w:r>
+      <w:r>
+        <w:tab/>
       </w:r>
       <w:r>
         <w:rPr>
           <w:rFonts w:ascii="Calibri" w:cs="Calibri" w:eastAsia="Calibri" w:hAnsi="Calibri"/>
           <w:b/>
           <w:bCs/>
-          <w:sz w:val="22"/>
-          <w:szCs w:val="22"/>
         </w:rPr>
         <w:t xml:space="preserve">El consentimiento depende de la representación:</w:t>
       </w:r>
       <w:r>
         <w:rPr>
           <w:rFonts w:ascii="Calibri" w:cs="Calibri" w:eastAsia="Calibri" w:hAnsi="Calibri"/>
-          <w:sz w:val="22"/>
-          <w:szCs w:val="22"/>
         </w:rPr>
         <w:t xml:space="preserve"> si esta termina o vence, </w:t>
       </w:r>
       <w:r>
         <w:rPr>
           <w:rFonts w:ascii="Consolas" w:cs="Consolas" w:eastAsia="Consolas" w:hAnsi="Consolas"/>
-          <w:sz w:val="22"/>
-          <w:szCs w:val="22"/>
+          <w:b w:val="false"/>
+          <w:bCs w:val="false"/>
+          <w:sz w:val="19"/>
+          <w:szCs w:val="19"/>
         </w:rPr>
         <w:t xml:space="preserve">vigente()</w:t>
       </w:r>
       <w:r>
         <w:rPr>
           <w:rFonts w:ascii="Calibri" w:cs="Calibri" w:eastAsia="Calibri" w:hAnsi="Calibri"/>
-          <w:sz w:val="22"/>
-          <w:szCs w:val="22"/>
         </w:rPr>
         <w:t xml:space="preserve"> pasa a falso de inmediato y </w:t>
       </w:r>
       <w:r>
         <w:rPr>
           <w:rFonts w:ascii="Consolas" w:cs="Consolas" w:eastAsia="Consolas" w:hAnsi="Consolas"/>
-          <w:sz w:val="22"/>
-          <w:szCs w:val="22"/>
+          <w:b w:val="false"/>
+          <w:bCs w:val="false"/>
+          <w:sz w:val="19"/>
+          <w:szCs w:val="19"/>
         </w:rPr>
         <w:t xml:space="preserve">cerrar_vencidos</w:t>
       </w:r>
       <w:r>
         <w:rPr>
           <w:rFonts w:ascii="Calibri" w:cs="Calibri" w:eastAsia="Calibri" w:hAnsi="Calibri"/>
-          <w:sz w:val="22"/>
-          <w:szCs w:val="22"/>
         </w:rPr>
         <w:t xml:space="preserve"> registra la revocación.</w:t>
       </w:r>
     </w:p>
     <w:p>
       <w:pPr>
-        <w:spacing w:after="120"/>
-      </w:pPr>
-      <w:r>
-        <w:rPr>
-          <w:rFonts w:ascii="Calibri" w:cs="Calibri" w:eastAsia="Calibri" w:hAnsi="Calibri"/>
-          <w:sz w:val="22"/>
-          <w:szCs w:val="22"/>
+        <w:spacing w:after="120" w:line="276"/>
+      </w:pPr>
+      <w:r>
+        <w:rPr>
+          <w:rFonts w:ascii="Calibri" w:cs="Calibri" w:eastAsia="Calibri" w:hAnsi="Calibri"/>
         </w:rPr>
         <w:t xml:space="preserve">Limitación declarada: la Ley 21.719 distingue a los menores de 14 años de los adolescentes de 14 a 17 (para estos últimos pueden aplicar reglas distintas según el tipo de dato). Se adoptó el criterio más conservador, 18, hasta confirmar con asesoría jurídica; está en una constante (</w:t>
       </w:r>
       <w:r>
         <w:rPr>
           <w:rFonts w:ascii="Consolas" w:cs="Consolas" w:eastAsia="Consolas" w:hAnsi="Consolas"/>
-          <w:sz w:val="22"/>
-          <w:szCs w:val="22"/>
+          <w:b w:val="false"/>
+          <w:bCs w:val="false"/>
+          <w:sz w:val="19"/>
+          <w:szCs w:val="19"/>
         </w:rPr>
         <w:t xml:space="preserve">EDAD_CONSENTIMIENTO_PROPIO</w:t>
       </w:r>
       <w:r>
         <w:rPr>
           <w:rFonts w:ascii="Calibri" w:cs="Calibri" w:eastAsia="Calibri" w:hAnsi="Calibri"/>
-          <w:sz w:val="22"/>
-          <w:szCs w:val="22"/>
         </w:rPr>
         <w:t xml:space="preserve">) para ajustarlo en un solo lugar.</w:t>
       </w:r>
     </w:p>
     <w:p>
       <w:pPr>
-        <w:pStyle w:val="Heading2"/>
+        <w:pStyle w:val="Heading1"/>
       </w:pPr>
       <w:r>
         <w:rPr>
@@ -2252,22 +2385,19 @@
           <w:ilvl w:val="0"/>
           <w:numId w:val="2"/>
         </w:numPr>
+        <w:spacing w:after="60" w:line="264"/>
       </w:pPr>
       <w:r>
         <w:rPr>
           <w:rFonts w:ascii="Calibri" w:cs="Calibri" w:eastAsia="Calibri" w:hAnsi="Calibri"/>
           <w:b/>
           <w:bCs/>
-          <w:sz w:val="22"/>
-          <w:szCs w:val="22"/>
         </w:rPr>
         <w:t xml:space="preserve">Aviso de privacidad</w:t>
       </w:r>
       <w:r>
         <w:rPr>
           <w:rFonts w:ascii="Calibri" w:cs="Calibri" w:eastAsia="Calibri" w:hAnsi="Calibri"/>
-          <w:sz w:val="22"/>
-          <w:szCs w:val="22"/>
         </w:rPr>
         <w:t xml:space="preserve"> (público): finalidades, fundamentos, conservación, derechos y menores.</w:t>
       </w:r>
@@ -2279,22 +2409,19 @@
           <w:ilvl w:val="0"/>
           <w:numId w:val="2"/>
         </w:numPr>
+        <w:spacing w:after="60" w:line="264"/>
       </w:pPr>
       <w:r>
         <w:rPr>
           <w:rFonts w:ascii="Calibri" w:cs="Calibri" w:eastAsia="Calibri" w:hAnsi="Calibri"/>
           <w:b/>
           <w:bCs/>
-          <w:sz w:val="22"/>
-          <w:szCs w:val="22"/>
         </w:rPr>
         <w:t xml:space="preserve">Registro:</w:t>
       </w:r>
       <w:r>
         <w:rPr>
           <w:rFonts w:ascii="Calibri" w:cs="Calibri" w:eastAsia="Calibri" w:hAnsi="Calibri"/>
-          <w:sz w:val="22"/>
-          <w:szCs w:val="22"/>
         </w:rPr>
         <w:t xml:space="preserve"> acuse del aviso (obligatorio, solo informa) y dos casillas opcionales por canal.</w:t>
       </w:r>
@@ -2306,22 +2433,19 @@
           <w:ilvl w:val="0"/>
           <w:numId w:val="2"/>
         </w:numPr>
+        <w:spacing w:after="60" w:line="264"/>
       </w:pPr>
       <w:r>
         <w:rPr>
           <w:rFonts w:ascii="Calibri" w:cs="Calibri" w:eastAsia="Calibri" w:hAnsi="Calibri"/>
           <w:b/>
           <w:bCs/>
-          <w:sz w:val="22"/>
-          <w:szCs w:val="22"/>
         </w:rPr>
         <w:t xml:space="preserve">Mis consentimientos</w:t>
       </w:r>
       <w:r>
         <w:rPr>
           <w:rFonts w:ascii="Calibri" w:cs="Calibri" w:eastAsia="Calibri" w:hAnsi="Calibri"/>
-          <w:sz w:val="22"/>
-          <w:szCs w:val="22"/>
         </w:rPr>
         <w:t xml:space="preserve"> (paciente): estado de cada finalidad, texto exacto con su versión, fechas, botones autorizar y retirar, historial; y las autorizaciones de sus representados.</w:t>
       </w:r>
@@ -2333,22 +2457,19 @@
           <w:ilvl w:val="0"/>
           <w:numId w:val="2"/>
         </w:numPr>
+        <w:spacing w:after="60" w:line="264"/>
       </w:pPr>
       <w:r>
         <w:rPr>
           <w:rFonts w:ascii="Calibri" w:cs="Calibri" w:eastAsia="Calibri" w:hAnsi="Calibri"/>
           <w:b/>
           <w:bCs/>
-          <w:sz w:val="22"/>
-          <w:szCs w:val="22"/>
         </w:rPr>
         <w:t xml:space="preserve">Representantes legales</w:t>
       </w:r>
       <w:r>
         <w:rPr>
           <w:rFonts w:ascii="Calibri" w:cs="Calibri" w:eastAsia="Calibri" w:hAnsi="Calibri"/>
-          <w:sz w:val="22"/>
-          <w:szCs w:val="22"/>
         </w:rPr>
         <w:t xml:space="preserve"> (recepción): registrar y terminar representaciones.</w:t>
       </w:r>
@@ -2360,29 +2481,26 @@
           <w:ilvl w:val="0"/>
           <w:numId w:val="2"/>
         </w:numPr>
+        <w:spacing w:after="60" w:line="264"/>
       </w:pPr>
       <w:r>
         <w:rPr>
           <w:rFonts w:ascii="Calibri" w:cs="Calibri" w:eastAsia="Calibri" w:hAnsi="Calibri"/>
           <w:b/>
           <w:bCs/>
-          <w:sz w:val="22"/>
-          <w:szCs w:val="22"/>
         </w:rPr>
         <w:t xml:space="preserve">Consentimientos</w:t>
       </w:r>
       <w:r>
         <w:rPr>
           <w:rFonts w:ascii="Calibri" w:cs="Calibri" w:eastAsia="Calibri" w:hAnsi="Calibri"/>
-          <w:sz w:val="22"/>
-          <w:szCs w:val="22"/>
         </w:rPr>
         <w:t xml:space="preserve"> (Encargado de privacidad): totales por finalidad y últimos movimientos con códigos seudónimos.</w:t>
       </w:r>
     </w:p>
     <w:p>
       <w:pPr>
-        <w:pStyle w:val="Heading2"/>
+        <w:pStyle w:val="Heading1"/>
       </w:pPr>
       <w:r>
         <w:rPr>
@@ -2393,113 +2511,109 @@
     </w:p>
     <w:p>
       <w:pPr>
-        <w:spacing w:after="120"/>
-      </w:pPr>
-      <w:r>
-        <w:rPr>
-          <w:rFonts w:ascii="Calibri" w:cs="Calibri" w:eastAsia="Calibri" w:hAnsi="Calibri"/>
-          <w:sz w:val="22"/>
-          <w:szCs w:val="22"/>
+        <w:spacing w:after="120" w:line="276"/>
+      </w:pPr>
+      <w:r>
+        <w:rPr>
+          <w:rFonts w:ascii="Calibri" w:cs="Calibri" w:eastAsia="Calibri" w:hAnsi="Calibri"/>
         </w:rPr>
         <w:t xml:space="preserve">La migración </w:t>
       </w:r>
       <w:r>
         <w:rPr>
           <w:rFonts w:ascii="Consolas" w:cs="Consolas" w:eastAsia="Consolas" w:hAnsi="Consolas"/>
-          <w:sz w:val="22"/>
-          <w:szCs w:val="22"/>
+          <w:b w:val="false"/>
+          <w:bCs w:val="false"/>
+          <w:sz w:val="19"/>
+          <w:szCs w:val="19"/>
         </w:rPr>
         <w:t xml:space="preserve">consentimientos.0002</w:t>
       </w:r>
       <w:r>
         <w:rPr>
           <w:rFonts w:ascii="Calibri" w:cs="Calibri" w:eastAsia="Calibri" w:hAnsi="Calibri"/>
-          <w:sz w:val="22"/>
-          <w:szCs w:val="22"/>
         </w:rPr>
         <w:t xml:space="preserve"> crea las dos finalidades con su texto v1 y convierte lo que había: quien marcó la casilla general queda con acuse del aviso v1 en la misma fecha; quien tenía </w:t>
       </w:r>
       <w:r>
         <w:rPr>
           <w:rFonts w:ascii="Consolas" w:cs="Consolas" w:eastAsia="Consolas" w:hAnsi="Consolas"/>
-          <w:sz w:val="22"/>
-          <w:szCs w:val="22"/>
+          <w:b w:val="false"/>
+          <w:bCs w:val="false"/>
+          <w:sz w:val="19"/>
+          <w:szCs w:val="19"/>
         </w:rPr>
         <w:t xml:space="preserve">recordatorios_activos</w:t>
       </w:r>
       <w:r>
         <w:rPr>
           <w:rFonts w:ascii="Calibri" w:cs="Calibri" w:eastAsia="Calibri" w:hAnsi="Calibri"/>
-          <w:sz w:val="22"/>
-          <w:szCs w:val="22"/>
         </w:rPr>
         <w:t xml:space="preserve"> queda con un consentimiento por cada canal y un registro de origen </w:t>
       </w:r>
       <w:r>
         <w:rPr>
           <w:rFonts w:ascii="Consolas" w:cs="Consolas" w:eastAsia="Consolas" w:hAnsi="Consolas"/>
-          <w:sz w:val="22"/>
-          <w:szCs w:val="22"/>
+          <w:b w:val="false"/>
+          <w:bCs w:val="false"/>
+          <w:sz w:val="19"/>
+          <w:szCs w:val="19"/>
         </w:rPr>
         <w:t xml:space="preserve">MIGRACION</w:t>
       </w:r>
       <w:r>
         <w:rPr>
           <w:rFonts w:ascii="Calibri" w:cs="Calibri" w:eastAsia="Calibri" w:hAnsi="Calibri"/>
-          <w:sz w:val="22"/>
-          <w:szCs w:val="22"/>
         </w:rPr>
         <w:t xml:space="preserve">. Después la migración de </w:t>
       </w:r>
       <w:r>
         <w:rPr>
           <w:rFonts w:ascii="Consolas" w:cs="Consolas" w:eastAsia="Consolas" w:hAnsi="Consolas"/>
-          <w:sz w:val="22"/>
-          <w:szCs w:val="22"/>
+          <w:b w:val="false"/>
+          <w:bCs w:val="false"/>
+          <w:sz w:val="19"/>
+          <w:szCs w:val="19"/>
         </w:rPr>
         <w:t xml:space="preserve">pacientes</w:t>
       </w:r>
       <w:r>
         <w:rPr>
           <w:rFonts w:ascii="Calibri" w:cs="Calibri" w:eastAsia="Calibri" w:hAnsi="Calibri"/>
-          <w:sz w:val="22"/>
-          <w:szCs w:val="22"/>
         </w:rPr>
         <w:t xml:space="preserve"> elimina los tres campos antiguos. En la base de desarrollo convirtió 2 finalidades, 4 consentimientos y 4 registros.</w:t>
       </w:r>
     </w:p>
     <w:p>
       <w:pPr>
-        <w:spacing w:after="120"/>
-      </w:pPr>
-      <w:r>
-        <w:rPr>
-          <w:rFonts w:ascii="Calibri" w:cs="Calibri" w:eastAsia="Calibri" w:hAnsi="Calibri"/>
-          <w:sz w:val="22"/>
-          <w:szCs w:val="22"/>
+        <w:spacing w:after="120" w:line="276"/>
+      </w:pPr>
+      <w:r>
+        <w:rPr>
+          <w:rFonts w:ascii="Calibri" w:cs="Calibri" w:eastAsia="Calibri" w:hAnsi="Calibri"/>
         </w:rPr>
         <w:t xml:space="preserve">Advertencia honesta: esos consentimientos migrados se dieron con la casilla antigua, cuyo texto no distinguía canales ni explicaba qué dato se usaba. Son defendibles como transición, pero en producción conviene pedir una reconfirmación subiendo </w:t>
       </w:r>
       <w:r>
         <w:rPr>
           <w:rFonts w:ascii="Consolas" w:cs="Consolas" w:eastAsia="Consolas" w:hAnsi="Consolas"/>
-          <w:sz w:val="22"/>
-          <w:szCs w:val="22"/>
+          <w:b w:val="false"/>
+          <w:bCs w:val="false"/>
+          <w:sz w:val="19"/>
+          <w:szCs w:val="19"/>
         </w:rPr>
         <w:t xml:space="preserve">version_minima_valida</w:t>
       </w:r>
       <w:r>
         <w:rPr>
           <w:rFonts w:ascii="Calibri" w:cs="Calibri" w:eastAsia="Calibri" w:hAnsi="Calibri"/>
-          <w:sz w:val="22"/>
-          <w:szCs w:val="22"/>
         </w:rPr>
         <w:t xml:space="preserve">.</w:t>
       </w:r>
     </w:p>
     <w:p>
       <w:pPr>
-        <w:pStyle w:val="Heading2"/>
+        <w:pStyle w:val="Heading1"/>
       </w:pPr>
       <w:r>
         <w:rPr>
@@ -2510,29 +2624,27 @@
     </w:p>
     <w:p>
       <w:pPr>
-        <w:spacing w:after="120"/>
-      </w:pPr>
-      <w:r>
-        <w:rPr>
-          <w:rFonts w:ascii="Calibri" w:cs="Calibri" w:eastAsia="Calibri" w:hAnsi="Calibri"/>
-          <w:sz w:val="22"/>
-          <w:szCs w:val="22"/>
+        <w:spacing w:after="120" w:line="276"/>
+      </w:pPr>
+      <w:r>
+        <w:rPr>
+          <w:rFonts w:ascii="Calibri" w:cs="Calibri" w:eastAsia="Calibri" w:hAnsi="Calibri"/>
         </w:rPr>
         <w:t xml:space="preserve">Pruebas en </w:t>
       </w:r>
       <w:r>
         <w:rPr>
           <w:rFonts w:ascii="Consolas" w:cs="Consolas" w:eastAsia="Consolas" w:hAnsi="Consolas"/>
-          <w:sz w:val="22"/>
-          <w:szCs w:val="22"/>
+          <w:b w:val="false"/>
+          <w:bCs w:val="false"/>
+          <w:sz w:val="19"/>
+          <w:szCs w:val="19"/>
         </w:rPr>
         <w:t xml:space="preserve">tests/integracion/test_consentimientos.py</w:t>
       </w:r>
       <w:r>
         <w:rPr>
           <w:rFonts w:ascii="Calibri" w:cs="Calibri" w:eastAsia="Calibri" w:hAnsi="Calibri"/>
-          <w:sz w:val="22"/>
-          <w:szCs w:val="22"/>
         </w:rPr>
         <w:t xml:space="preserve"> (31 pruebas). Entre otras:</w:t>
       </w:r>
@@ -2544,12 +2656,11 @@
           <w:ilvl w:val="0"/>
           <w:numId w:val="2"/>
         </w:numPr>
-      </w:pPr>
-      <w:r>
-        <w:rPr>
-          <w:rFonts w:ascii="Calibri" w:cs="Calibri" w:eastAsia="Calibri" w:hAnsi="Calibri"/>
-          <w:sz w:val="22"/>
-          <w:szCs w:val="22"/>
+        <w:spacing w:after="60" w:line="264"/>
+      </w:pPr>
+      <w:r>
+        <w:rPr>
+          <w:rFonts w:ascii="Calibri" w:cs="Calibri" w:eastAsia="Calibri" w:hAnsi="Calibri"/>
         </w:rPr>
         <w:t xml:space="preserve">Otorgar guarda estado, fecha, versión y deja historial; revocar guarda fecha y conserva ambas filas.</w:t>
       </w:r>
@@ -2561,12 +2672,11 @@
           <w:ilvl w:val="0"/>
           <w:numId w:val="2"/>
         </w:numPr>
-      </w:pPr>
-      <w:r>
-        <w:rPr>
-          <w:rFonts w:ascii="Calibri" w:cs="Calibri" w:eastAsia="Calibri" w:hAnsi="Calibri"/>
-          <w:sz w:val="22"/>
-          <w:szCs w:val="22"/>
+        <w:spacing w:after="60" w:line="264"/>
+      </w:pPr>
+      <w:r>
+        <w:rPr>
+          <w:rFonts w:ascii="Calibri" w:cs="Calibri" w:eastAsia="Calibri" w:hAnsi="Calibri"/>
         </w:rPr>
         <w:t xml:space="preserve">Repetir una acción no ensucia el historial; otorgar un canal no habilita el otro.</w:t>
       </w:r>
@@ -2578,12 +2688,11 @@
           <w:ilvl w:val="0"/>
           <w:numId w:val="2"/>
         </w:numPr>
-      </w:pPr>
-      <w:r>
-        <w:rPr>
-          <w:rFonts w:ascii="Calibri" w:cs="Calibri" w:eastAsia="Calibri" w:hAnsi="Calibri"/>
-          <w:sz w:val="22"/>
-          <w:szCs w:val="22"/>
+        <w:spacing w:after="60" w:line="264"/>
+      </w:pPr>
+      <w:r>
+        <w:rPr>
+          <w:rFonts w:ascii="Calibri" w:cs="Calibri" w:eastAsia="Calibri" w:hAnsi="Calibri"/>
         </w:rPr>
         <w:t xml:space="preserve">Historial y textos son inalterables desde la aplicación.</w:t>
       </w:r>
@@ -2595,12 +2704,11 @@
           <w:ilvl w:val="0"/>
           <w:numId w:val="2"/>
         </w:numPr>
-      </w:pPr>
-      <w:r>
-        <w:rPr>
-          <w:rFonts w:ascii="Calibri" w:cs="Calibri" w:eastAsia="Calibri" w:hAnsi="Calibri"/>
-          <w:sz w:val="22"/>
-          <w:szCs w:val="22"/>
+        <w:spacing w:after="60" w:line="264"/>
+      </w:pPr>
+      <w:r>
+        <w:rPr>
+          <w:rFonts w:ascii="Calibri" w:cs="Calibri" w:eastAsia="Calibri" w:hAnsi="Calibri"/>
         </w:rPr>
         <w:t xml:space="preserve">Un texto nuevo con cambio de alcance obliga a reconfirmar.</w:t>
       </w:r>
@@ -2612,12 +2720,11 @@
           <w:ilvl w:val="0"/>
           <w:numId w:val="2"/>
         </w:numPr>
-      </w:pPr>
-      <w:r>
-        <w:rPr>
-          <w:rFonts w:ascii="Calibri" w:cs="Calibri" w:eastAsia="Calibri" w:hAnsi="Calibri"/>
-          <w:sz w:val="22"/>
-          <w:szCs w:val="22"/>
+        <w:spacing w:after="60" w:line="264"/>
+      </w:pPr>
+      <w:r>
+        <w:rPr>
+          <w:rFonts w:ascii="Calibri" w:cs="Calibri" w:eastAsia="Calibri" w:hAnsi="Calibri"/>
         </w:rPr>
         <w:t xml:space="preserve">La auditoría registra el cambio sin RUT, correo, teléfono ni nombre.</w:t>
       </w:r>
@@ -2629,12 +2736,11 @@
           <w:ilvl w:val="0"/>
           <w:numId w:val="2"/>
         </w:numPr>
-      </w:pPr>
-      <w:r>
-        <w:rPr>
-          <w:rFonts w:ascii="Calibri" w:cs="Calibri" w:eastAsia="Calibri" w:hAnsi="Calibri"/>
-          <w:sz w:val="22"/>
-          <w:szCs w:val="22"/>
+        <w:spacing w:after="60" w:line="264"/>
+      </w:pPr>
+      <w:r>
+        <w:rPr>
+          <w:rFonts w:ascii="Calibri" w:cs="Calibri" w:eastAsia="Calibri" w:hAnsi="Calibri"/>
         </w:rPr>
         <w:t xml:space="preserve">Sin consentimiento no se generan recordatorios; solo sale el canal consentido; revocar cancela lo pendiente y no envía nada.</w:t>
       </w:r>
@@ -2646,12 +2752,11 @@
           <w:ilvl w:val="0"/>
           <w:numId w:val="2"/>
         </w:numPr>
-      </w:pPr>
-      <w:r>
-        <w:rPr>
-          <w:rFonts w:ascii="Calibri" w:cs="Calibri" w:eastAsia="Calibri" w:hAnsi="Calibri"/>
-          <w:sz w:val="22"/>
-          <w:szCs w:val="22"/>
+        <w:spacing w:after="60" w:line="264"/>
+      </w:pPr>
+      <w:r>
+        <w:rPr>
+          <w:rFonts w:ascii="Calibri" w:cs="Calibri" w:eastAsia="Calibri" w:hAnsi="Calibri"/>
         </w:rPr>
         <w:t xml:space="preserve">El portal rechaza activar un canal sin consentimiento.</w:t>
       </w:r>
@@ -2663,12 +2768,11 @@
           <w:ilvl w:val="0"/>
           <w:numId w:val="2"/>
         </w:numPr>
-      </w:pPr>
-      <w:r>
-        <w:rPr>
-          <w:rFonts w:ascii="Calibri" w:cs="Calibri" w:eastAsia="Calibri" w:hAnsi="Calibri"/>
-          <w:sz w:val="22"/>
-          <w:szCs w:val="22"/>
+        <w:spacing w:after="60" w:line="264"/>
+      </w:pPr>
+      <w:r>
+        <w:rPr>
+          <w:rFonts w:ascii="Calibri" w:cs="Calibri" w:eastAsia="Calibri" w:hAnsi="Calibri"/>
         </w:rPr>
         <w:t xml:space="preserve">Menores: no consienten por sí mismos; un tercero no puede decidir; el representante verificado sí; al terminar la representación el consentimiento deja de valer; la representación vencida no sirve; recepción rechaza representar a un adulto.</w:t>
       </w:r>
@@ -2680,32 +2784,29 @@
           <w:ilvl w:val="0"/>
           <w:numId w:val="2"/>
         </w:numPr>
-      </w:pPr>
-      <w:r>
-        <w:rPr>
-          <w:rFonts w:ascii="Calibri" w:cs="Calibri" w:eastAsia="Calibri" w:hAnsi="Calibri"/>
-          <w:sz w:val="22"/>
-          <w:szCs w:val="22"/>
+        <w:spacing w:after="60" w:line="264"/>
+      </w:pPr>
+      <w:r>
+        <w:rPr>
+          <w:rFonts w:ascii="Calibri" w:cs="Calibri" w:eastAsia="Calibri" w:hAnsi="Calibri"/>
         </w:rPr>
         <w:t xml:space="preserve">El panel es solo del Encargado y no muestra identidad.</w:t>
       </w:r>
     </w:p>
     <w:p>
       <w:pPr>
-        <w:spacing w:after="120"/>
-      </w:pPr>
-      <w:r>
-        <w:rPr>
-          <w:rFonts w:ascii="Calibri" w:cs="Calibri" w:eastAsia="Calibri" w:hAnsi="Calibri"/>
-          <w:sz w:val="22"/>
-          <w:szCs w:val="22"/>
+        <w:spacing w:after="120" w:line="276"/>
+      </w:pPr>
+      <w:r>
+        <w:rPr>
+          <w:rFonts w:ascii="Calibri" w:cs="Calibri" w:eastAsia="Calibri" w:hAnsi="Calibri"/>
         </w:rPr>
         <w:t xml:space="preserve">Eventos de auditoría reales generados por estas operaciones: documento 05, sección 3.</w:t>
       </w:r>
     </w:p>
     <w:p>
       <w:pPr>
-        <w:pStyle w:val="Heading2"/>
+        <w:pStyle w:val="Heading1"/>
       </w:pPr>
       <w:r>
         <w:rPr>
@@ -2721,12 +2822,11 @@
           <w:ilvl w:val="0"/>
           <w:numId w:val="2"/>
         </w:numPr>
-      </w:pPr>
-      <w:r>
-        <w:rPr>
-          <w:rFonts w:ascii="Calibri" w:cs="Calibri" w:eastAsia="Calibri" w:hAnsi="Calibri"/>
-          <w:sz w:val="22"/>
-          <w:szCs w:val="22"/>
+        <w:spacing w:after="60" w:line="264"/>
+      </w:pPr>
+      <w:r>
+        <w:rPr>
+          <w:rFonts w:ascii="Calibri" w:cs="Calibri" w:eastAsia="Calibri" w:hAnsi="Calibri"/>
         </w:rPr>
         <w:t xml:space="preserve">El envío de SMS real depende de un proveedor que no está conectado: hoy el módulo registra el envío en el log con el teléfono enmascarado. El consentimiento sí se exige igual.</w:t>
       </w:r>
@@ -2738,12 +2838,11 @@
           <w:ilvl w:val="0"/>
           <w:numId w:val="2"/>
         </w:numPr>
-      </w:pPr>
-      <w:r>
-        <w:rPr>
-          <w:rFonts w:ascii="Calibri" w:cs="Calibri" w:eastAsia="Calibri" w:hAnsi="Calibri"/>
-          <w:sz w:val="22"/>
-          <w:szCs w:val="22"/>
+        <w:spacing w:after="60" w:line="264"/>
+      </w:pPr>
+      <w:r>
+        <w:rPr>
+          <w:rFonts w:ascii="Calibri" w:cs="Calibri" w:eastAsia="Calibri" w:hAnsi="Calibri"/>
         </w:rPr>
         <w:t xml:space="preserve">No hay un mecanismo de "dar de baja" desde el propio correo o SMS (enlace o respuesta STOP); la baja se hace en el portal.</w:t>
       </w:r>
@@ -2755,20 +2854,20 @@
           <w:ilvl w:val="0"/>
           <w:numId w:val="2"/>
         </w:numPr>
-      </w:pPr>
-      <w:r>
-        <w:rPr>
-          <w:rFonts w:ascii="Calibri" w:cs="Calibri" w:eastAsia="Calibri" w:hAnsi="Calibri"/>
-          <w:sz w:val="22"/>
-          <w:szCs w:val="22"/>
+        <w:spacing w:after="60" w:line="264"/>
+      </w:pPr>
+      <w:r>
+        <w:rPr>
+          <w:rFonts w:ascii="Calibri" w:cs="Calibri" w:eastAsia="Calibri" w:hAnsi="Calibri"/>
         </w:rPr>
         <w:t xml:space="preserve">Los textos de consentimiento no pasaron por revisión jurídica; son un borrador técnicamente consistente.</w:t>
       </w:r>
     </w:p>
     <w:sectPr>
-      <w:footerReference w:type="default" r:id="rId6"/>
+      <w:headerReference w:type="default" r:id="rId6"/>
+      <w:footerReference w:type="default" r:id="rId7"/>
       <w:pgSz w:w="12240" w:h="15840" w:orient="portrait"/>
-      <w:pgMar w:top="1300" w:right="1440" w:bottom="1300" w:left="1440" w:header="708" w:footer="708" w:gutter="0"/>
+      <w:pgMar w:top="1080" w:right="1080" w:bottom="1080" w:left="1080" w:header="708" w:footer="708" w:gutter="0"/>
       <w:pgNumType/>
       <w:docGrid w:linePitch="360"/>
     </w:sectPr>
@@ -2822,14 +2921,16 @@
     <w:r>
       <w:rPr>
         <w:rFonts w:ascii="Calibri" w:cs="Calibri" w:eastAsia="Calibri" w:hAnsi="Calibri"/>
+        <w:color w:val="55666A"/>
         <w:sz w:val="16"/>
         <w:szCs w:val="16"/>
       </w:rPr>
-      <w:t xml:space="preserve">Centro Médico Altavida · IIT421W Seguridad y Protección de Datos · página </w:t>
+      <w:t xml:space="preserve">Página </w:t>
     </w:r>
     <w:r>
       <w:rPr>
         <w:rFonts w:ascii="Calibri" w:cs="Calibri" w:eastAsia="Calibri" w:hAnsi="Calibri"/>
+        <w:color w:val="55666A"/>
         <w:sz w:val="16"/>
         <w:szCs w:val="16"/>
       </w:rPr>
@@ -2838,6 +2939,7 @@
     <w:r>
       <w:rPr>
         <w:rFonts w:ascii="Calibri" w:cs="Calibri" w:eastAsia="Calibri" w:hAnsi="Calibri"/>
+        <w:color w:val="55666A"/>
         <w:sz w:val="16"/>
         <w:szCs w:val="16"/>
       </w:rPr>
@@ -2846,6 +2948,7 @@
     <w:r>
       <w:rPr>
         <w:rFonts w:ascii="Calibri" w:cs="Calibri" w:eastAsia="Calibri" w:hAnsi="Calibri"/>
+        <w:color w:val="55666A"/>
         <w:sz w:val="16"/>
         <w:szCs w:val="16"/>
       </w:rPr>
@@ -2854,6 +2957,7 @@
     <w:r>
       <w:rPr>
         <w:rFonts w:ascii="Calibri" w:cs="Calibri" w:eastAsia="Calibri" w:hAnsi="Calibri"/>
+        <w:color w:val="55666A"/>
         <w:sz w:val="16"/>
         <w:szCs w:val="16"/>
       </w:rPr>
@@ -2900,6 +3004,25 @@
 </w:footnotes>
 </file>
 
+<file path=word/header1.xml><?xml version="1.0" encoding="utf-8"?>
+<w:hdr xmlns:wpc="http://schemas.microsoft.com/office/word/2010/wordprocessingCanvas" xmlns:mc="http://schemas.openxmlformats.org/markup-compatibility/2006" xmlns:o="urn:schemas-microsoft-com:office:office" xmlns:r="http://schemas.openxmlformats.org/officeDocument/2006/relationships" xmlns:m="http://schemas.openxmlformats.org/officeDocument/2006/math" xmlns:v="urn:schemas-microsoft-com:vml" xmlns:wp14="http://schemas.microsoft.com/office/word/2010/wordprocessingDrawing" xmlns:wp="http://schemas.openxmlformats.org/drawingml/2006/wordprocessingDrawing" xmlns:w10="urn:schemas-microsoft-com:office:word" xmlns:w="http://schemas.openxmlformats.org/wordprocessingml/2006/main" xmlns:w14="http://schemas.microsoft.com/office/word/2010/wordml" xmlns:w15="http://schemas.microsoft.com/office/word/2012/wordml" xmlns:wpg="http://schemas.microsoft.com/office/word/2010/wordprocessingGroup" xmlns:wpi="http://schemas.microsoft.com/office/word/2010/wordprocessingInk" xmlns:wne="http://schemas.microsoft.com/office/word/2006/wordml" xmlns:wps="http://schemas.microsoft.com/office/word/2010/wordprocessingShape" xmlns:cx="http://schemas.microsoft.com/office/drawing/2014/chartex" xmlns:cx1="http://schemas.microsoft.com/office/drawing/2015/9/8/chartex" xmlns:cx2="http://schemas.microsoft.com/office/drawing/2015/10/21/chartex" xmlns:cx3="http://schemas.microsoft.com/office/drawing/2016/5/9/chartex" xmlns:cx4="http://schemas.microsoft.com/office/drawing/2016/5/10/chartex" xmlns:cx5="http://schemas.microsoft.com/office/drawing/2016/5/11/chartex" xmlns:cx6="http://schemas.microsoft.com/office/drawing/2016/5/12/chartex" xmlns:cx7="http://schemas.microsoft.com/office/drawing/2016/5/13/chartex" xmlns:cx8="http://schemas.microsoft.com/office/drawing/2016/5/14/chartex" xmlns:w16cid="http://schemas.microsoft.com/office/word/2016/wordml/cid" xmlns:w16se="http://schemas.microsoft.com/office/word/2015/wordml/symex">
+  <w:p>
+    <w:pPr>
+      <w:jc w:val="right"/>
+    </w:pPr>
+    <w:r>
+      <w:rPr>
+        <w:rFonts w:ascii="Calibri" w:cs="Calibri" w:eastAsia="Calibri" w:hAnsi="Calibri"/>
+        <w:color w:val="55666A"/>
+        <w:sz w:val="16"/>
+        <w:szCs w:val="16"/>
+      </w:rPr>
+      <w:t xml:space="preserve">Centro Médico Altavida · Protección de datos</w:t>
+    </w:r>
+  </w:p>
+</w:hdr>
+</file>
+
 <file path=word/numbering.xml><?xml version="1.0" encoding="utf-8"?>
 <w:numbering xmlns:wpc="http://schemas.microsoft.com/office/word/2010/wordprocessingCanvas" xmlns:mc="http://schemas.openxmlformats.org/markup-compatibility/2006" xmlns:o="urn:schemas-microsoft-com:office:office" xmlns:r="http://schemas.openxmlformats.org/officeDocument/2006/relationships" xmlns:m="http://schemas.openxmlformats.org/officeDocument/2006/math" xmlns:v="urn:schemas-microsoft-com:vml" xmlns:wp14="http://schemas.microsoft.com/office/word/2010/wordprocessingDrawing" xmlns:wp="http://schemas.openxmlformats.org/drawingml/2006/wordprocessingDrawing" xmlns:w10="urn:schemas-microsoft-com:office:word" xmlns:w="http://schemas.openxmlformats.org/wordprocessingml/2006/main" xmlns:w14="http://schemas.microsoft.com/office/word/2010/wordml" xmlns:w15="http://schemas.microsoft.com/office/word/2012/wordml" xmlns:wpg="http://schemas.microsoft.com/office/word/2010/wordprocessingGroup" xmlns:wpi="http://schemas.microsoft.com/office/word/2010/wordprocessingInk" xmlns:wne="http://schemas.microsoft.com/office/word/2006/wordml" xmlns:wps="http://schemas.microsoft.com/office/word/2010/wordprocessingShape" mc:Ignorable="w14 w15 wp14">
   <w:abstractNum w:abstractNumId="1" w15:restartNumberingAfterBreak="0">
@@ -2991,7 +3114,7 @@
     <w:lvl w:ilvl="0" w:tentative="1">
       <w:start w:val="1"/>
       <w:numFmt w:val="bullet"/>
-      <w:lvlText w:val="•"/>
+      <w:lvlText w:val="●"/>
       <w:lvlJc w:val="left"/>
       <w:pPr>
         <w:ind w:left="720" w:hanging="360"/>
@@ -3019,8 +3142,8 @@
     <w:rPrDefault>
       <w:rPr>
         <w:rFonts w:ascii="Calibri" w:cs="Calibri" w:eastAsia="Calibri" w:hAnsi="Calibri"/>
-        <w:sz w:val="22"/>
-        <w:szCs w:val="22"/>
+        <w:sz w:val="21"/>
+        <w:szCs w:val="21"/>
       </w:rPr>
     </w:rPrDefault>
     <w:pPrDefault/>
@@ -3052,6 +3175,17 @@
     <w:rPr>
       <w:sz w:val="56"/>
       <w:szCs w:val="56"/>
+    </w:rPr>
+  </w:style>
+  <w:style w:type="paragraph" w:styleId="Heading3">
+    <w:name w:val="Heading 3"/>
+    <w:basedOn w:val="Normal"/>
+    <w:next w:val="Normal"/>
+    <w:qFormat/>
+    <w:rPr>
+      <w:color w:val="1F4D78"/>
+      <w:sz w:val="24"/>
+      <w:szCs w:val="24"/>
     </w:rPr>
   </w:style>
   <w:style w:type="paragraph" w:styleId="Heading4">
@@ -3092,11 +3226,6 @@
       <w:b/>
       <w:bCs/>
     </w:rPr>
-  </w:style>
-  <w:style w:type="paragraph" w:styleId="ListParagraph">
-    <w:name w:val="List Paragraph"/>
-    <w:basedOn w:val="Normal"/>
-    <w:qFormat/>
   </w:style>
   <w:style w:type="paragraph" w:styleId="Caption">
     <w:name w:val="caption"/>
@@ -3144,7 +3273,7 @@
     <w:unhideWhenUsed/>
     <w:pPr>
       <w:spacing w:after="100"/>
-      <w:ind w:left="220"/>
+      <w:ind w:left="210"/>
     </w:pPr>
   </w:style>
   <w:style w:type="paragraph" w:styleId="TOC3">
@@ -3156,7 +3285,7 @@
     <w:unhideWhenUsed/>
     <w:pPr>
       <w:spacing w:after="100"/>
-      <w:ind w:left="440"/>
+      <w:ind w:left="420"/>
     </w:pPr>
   </w:style>
   <w:style w:type="paragraph" w:styleId="TOC4">
@@ -3168,7 +3297,7 @@
     <w:unhideWhenUsed/>
     <w:pPr>
       <w:spacing w:after="100"/>
-      <w:ind w:left="660"/>
+      <w:ind w:left="630"/>
     </w:pPr>
   </w:style>
   <w:style w:type="paragraph" w:styleId="TOC5">
@@ -3180,7 +3309,7 @@
     <w:unhideWhenUsed/>
     <w:pPr>
       <w:spacing w:after="100"/>
-      <w:ind w:left="880"/>
+      <w:ind w:left="840"/>
     </w:pPr>
   </w:style>
   <w:style w:type="paragraph" w:styleId="TOC6">
@@ -3192,7 +3321,7 @@
     <w:unhideWhenUsed/>
     <w:pPr>
       <w:spacing w:after="100"/>
-      <w:ind w:left="1100"/>
+      <w:ind w:left="1050"/>
     </w:pPr>
   </w:style>
   <w:style w:type="paragraph" w:styleId="TOC7">
@@ -3204,7 +3333,7 @@
     <w:unhideWhenUsed/>
     <w:pPr>
       <w:spacing w:after="100"/>
-      <w:ind w:left="1320"/>
+      <w:ind w:left="1260"/>
     </w:pPr>
   </w:style>
   <w:style w:type="paragraph" w:styleId="TOC8">
@@ -3216,7 +3345,7 @@
     <w:unhideWhenUsed/>
     <w:pPr>
       <w:spacing w:after="100"/>
-      <w:ind w:left="1540"/>
+      <w:ind w:left="1470"/>
     </w:pPr>
   </w:style>
   <w:style w:type="paragraph" w:styleId="TOC9">
@@ -3228,7 +3357,7 @@
     <w:unhideWhenUsed/>
     <w:pPr>
       <w:spacing w:after="100"/>
-      <w:ind w:left="1760"/>
+      <w:ind w:left="1680"/>
     </w:pPr>
   </w:style>
   <w:style w:type="character" w:styleId="Hyperlink">
@@ -3328,16 +3457,16 @@
     <w:next w:val="Normal"/>
     <w:qFormat/>
     <w:pPr>
-      <w:spacing w:after="160" w:before="300"/>
+      <w:spacing w:after="160" w:before="360"/>
       <w:outlineLvl w:val="0"/>
     </w:pPr>
     <w:rPr>
       <w:rFonts w:ascii="Calibri" w:cs="Calibri" w:eastAsia="Calibri" w:hAnsi="Calibri"/>
       <w:b/>
       <w:bCs/>
-      <w:color w:val="1F3A5F"/>
-      <w:sz w:val="34"/>
-      <w:szCs w:val="34"/>
+      <w:color w:val="0F6E6A"/>
+      <w:sz w:val="32"/>
+      <w:szCs w:val="32"/>
     </w:rPr>
   </w:style>
   <w:style w:type="paragraph" w:styleId="Heading2">
@@ -3346,34 +3475,22 @@
     <w:next w:val="Normal"/>
     <w:qFormat/>
     <w:pPr>
-      <w:spacing w:after="120" w:before="240"/>
+      <w:spacing w:after="100" w:before="240"/>
       <w:outlineLvl w:val="1"/>
     </w:pPr>
     <w:rPr>
       <w:rFonts w:ascii="Calibri" w:cs="Calibri" w:eastAsia="Calibri" w:hAnsi="Calibri"/>
       <w:b/>
       <w:bCs/>
-      <w:color w:val="1F3A5F"/>
-      <w:sz w:val="28"/>
-      <w:szCs w:val="28"/>
+      <w:color w:val="1B2A2F"/>
+      <w:sz w:val="25"/>
+      <w:szCs w:val="25"/>
     </w:rPr>
   </w:style>
-  <w:style w:type="paragraph" w:styleId="Heading3">
-    <w:name w:val="Heading 3"/>
+  <w:style w:type="paragraph" w:styleId="ListParagraph">
+    <w:name w:val="List Paragraph"/>
     <w:basedOn w:val="Normal"/>
-    <w:next w:val="Normal"/>
     <w:qFormat/>
-    <w:pPr>
-      <w:spacing w:after="100" w:before="180"/>
-      <w:outlineLvl w:val="2"/>
-    </w:pPr>
-    <w:rPr>
-      <w:rFonts w:ascii="Calibri" w:cs="Calibri" w:eastAsia="Calibri" w:hAnsi="Calibri"/>
-      <w:b/>
-      <w:bCs/>
-      <w:sz w:val="24"/>
-      <w:szCs w:val="24"/>
-    </w:rPr>
   </w:style>
 </w:styles>
 </file>

</xml_diff>